<commit_message>
Proofcheck Flour Play Italian: SIGNIFICANT (31 edits)
Co-Authored-By: Claude Opus 5.5 <noreply@anthropic.com>
Claude-Session: https://claude.ai/code/session_012Cm8JxdqzjuttdUSdkQCUg
</commit_message>
<xml_diff>
--- a/translated/corrected/Flour Play - ASSEMBLED - FORMATTED_Italian.docx
+++ b/translated/corrected/Flour Play - ASSEMBLED - FORMATTED_Italian.docx
@@ -197,7 +197,7 @@
     <w:p/>
     <w:p>
       <w:r>
-        <w:t>Dot rise la sua risata breve e secca dall'altra parte del circolo, senza distogliere lo sguardo dalla sua ghirlanda, che era già grande il doppio di quella di chiunque altra e due volte più fitta. «È a caccia del tuo trucco dal giorno in cui sei arrivata. Cacciava il mio nel millenovecento qualcosa.» Dot era robusta, coi capelli grigi e diceva moltissimo con pochissime parole. Faceva ghirlande in quel negozio da decenni. Si vedeva dalle sue mani. Non si fermavano mai e non sbagliavano mai un colpo.</w:t>
+        <w:t xml:space="preserve">Dot rise la sua risata breve e secca dall'altra parte del circolo, senza distogliere lo sguardo dalla sua ghirlanda, che era già grande una volta e mezza quella di chiunque altra e due volte più fitta. «È a caccia del tuo trucco dal giorno in cui sei arrivata. Dava la caccia al mio nel millenovecentottanta e qualcosa.» Dot era robusta, coi capelli grigi e diceva moltissimo con pochissime parole. Faceva ghirlande in quel negozio da decenni. Si vedeva dalle sue mani. Non si fermavano mai e non sbagliavano mai un colpo.</w:t>
       </w:r>
     </w:p>
     <w:p/>
@@ -251,7 +251,7 @@
     <w:p/>
     <w:p>
       <w:r>
-        <w:t>«Che nessuno si alzi» annunciò, cosa che nessuna aveva mostrato il minimo segno di fare. Posò sul tavolo, tra le pigne e il nastro, una scatola da pasticceria grande quanto una cappelliera e si mise i pugni sui fianchi a scrutarci. Greta possedeva la Holly Jolly Bakery lungo il viale, ed era fatta a forma di ciambella, rotonda e spolverata dappertutto. Quella mattina aveva il grembiule pieno di farina che non si era preoccupata di spazzolare via. «Ho sfornato una teglia di muffin al cioccolato e noci nientemeno che un'ora fa e mi sono detta, Greta, chi è che siede in un negozio freddo a rendersi utile stamattina, e la risposta siete tutte voi, quindi ecco qua.»</w:t>
+        <w:t xml:space="preserve">«Che nessuno si alzi» annunciò, cosa che nessuna aveva mostrato il minimo segno di fare. Posò sul tavolo, tra le pigne e il nastro, una scatola della panetteria grande quanto una cappelliera e si mise i pugni sui fianchi a scrutarci. Greta possedeva la Holly Jolly Bakery lungo il viale, ed era fatta a forma di ciambella, rotonda e spolverata dappertutto. Quella mattina aveva il grembiule pieno di farina che non si era preoccupata di spazzolare via. «Ho sfornato una teglia di muffin al cioccolato e noci pecan neanche un'ora fa e mi sono detta, Greta, chi è che siede in un negozio freddo a rendersi utile stamattina, e la risposta siete tutte voi, quindi ecco qua.»</w:t>
       </w:r>
     </w:p>
     <w:p/>
@@ -263,7 +263,7 @@
     <w:p/>
     <w:p>
       <w:r>
-        <w:t>«Qualcuno deve pur farlo. Voi non lo farete di certo da sole.» Stava già sollevando il coperchio. L'odore uscì e si mescolò all'abete nel mezzo della stanza, cioccolato e zucchero di canna sovrapposti al pino verde e freddo. Pensai che fosse quanto di più vicino all'odore dell'intera stagione in arrivo avessi mai conosciuto. «E ci sono biscottini allo zenzero sul fondo, quindi non fate che prendervi solo i muffin e lasciare i biscotti, Dot, ti ho vista farlo alla fiera e non me ne sono dimenticata.»</w:t>
+        <w:t xml:space="preserve">«Qualcuno deve pur farlo. Voi non lo farete di certo da sole.» Stava già sollevando il coperchio. L'odore uscì e si mescolò all'abete nel mezzo della stanza, cioccolato e zucchero di canna sovrapposti al pino verde e freddo. Pensai che fosse quanto di più vicino all'odore dell'intera stagione in arrivo avessi mai conosciuto. «E ci sono biscottini allo zenzero sul fondo, quindi non fate che prendervi solo i muffin e lasciare i biscotti, Dot, ti ho vista farlo alla Grange e non me ne sono dimenticata.»</w:t>
       </w:r>
     </w:p>
     <w:p/>
@@ -389,7 +389,7 @@
     <w:p/>
     <w:p>
       <w:r>
-        <w:t>«L'idea di qualche scherzo» sentenziò Dot. «Girato nella notte. Ragazzi.»</w:t>
+        <w:t xml:space="preserve">«Lo scherzo di qualcuno» sentenziò Dot. «Girato nella notte. Ragazzi.»</w:t>
       </w:r>
     </w:p>
     <w:p/>
@@ -419,7 +419,7 @@
     <w:p/>
     <w:p>
       <w:r>
-        <w:t>Perché conoscevo la differenza. Vivevo ormai da molto tempo accanto alla magia del Natale. Abbastanza a lungo da riconoscerla nelle ossa, chiara come un passo sulle mie scale. Non si trattava di un bambino con le dita fredde. La magia era a piede libero a Frost Falls. Era a piede libero dal nostro arrivo, in cerca di una dimora. Mio marito ne stava costruendo una. Con lentezza e pazienza nel suo laboratorio, un focolare in cui potersi insediare, e ogni giorno si avvicinava un po' di più al fuoco. Ma non si era ancora stabilita. Si trovava ancora in giro per il paese di notte, goffa e priva di qualsiasi malizia, a compiere le piccole cose impossibili che la magia fa quando ha più sentimento che senno. Trasformando le luci del festival da arancioni a oro. E adesso, a quanto pareva, facendo fare il giro a un pupazzo di neve nel buio perché guardasse qualunque cosa avesse catturato la sua attenzione errabonda.</w:t>
+        <w:t xml:space="preserve">Perché conoscevo la differenza. Vivevo ormai da molto tempo accanto alla magia del Natale. Abbastanza a lungo da riconoscerla nelle ossa, chiara come un passo sulle mie scale. Non si trattava di un bambino con le dita fredde. La magia era a piede libero a Frost Falls. Era a piede libero dal nostro arrivo, in cerca di una dimora. Mio marito ne stava costruendo una. Con lentezza e pazienza nella sua officina, un focolare in cui potersi insediare, e ogni giorno si avvicinava un po' di più al fuoco. Ma non si era ancora stabilita. Si trovava ancora in giro per il paese di notte, goffa e priva di qualsiasi malizia, a compiere le piccole cose impossibili che la magia fa quando ha più sentimento che senno. Trasformando le luci del festival da arancioni a oro. E adesso, a quanto pareva, facendo fare il giro a un pupazzo di neve nel buio perché guardasse qualunque cosa avesse catturato la sua attenzione errabonda.</w:t>
       </w:r>
     </w:p>
     <w:p/>
@@ -2531,7 +2531,7 @@
         <w:t>C'è cattivo odore. Ho visto un topo. La mia brioche era cruda al centro.</w:t>
       </w:r>
       <w:r>
-        <w:t xml:space="preserve"> Sensazioni, per lo più, metà delle quali dettate dal rancore, e io smisto il rancore sulla soglia di casa prima di aprire la cartella.» Si sistemò il cappello. «Questa non sembrava scritta così. È arrivata dattiloscritta e citava i commi specifici. Mi ha indicato l'articolo esatto sulla temperatura del lavandino di servizio, capitolo e sezione. Ha nominato lo stucco e la fessura della porta usando i termini tecnici prima che io avessi messo piede dentro, come se stesse leggendo una lista di controllo tratta dal mio manuale. Ha definito la cella frigorifera "la camera fredda", come fosse un nome proprio, e il lavandino di servizio "il lavandino Hobart". Chiunque l'abbia scritta sapeva per cosa viene verbalizzata una cucina commerciale, lo sapeva alla perfezione e sapeva esattamente dove un vecchio edificio presenta i suoi punti deboli.» Aprì la porta sul freddo. «Di solito chi conosce così bene il regolamento non è la persona che presenta l'esposto. Di solito ha una cucina propria a cui badare.»</w:t>
+        <w:t xml:space="preserve"> Sensazioni, per lo più, metà delle quali dettate dal rancore, e io smisto il rancore sulla soglia di casa prima di aprire la cartella.» Si sistemò il cappello. «Questa non sembrava scritta così. È arrivata dattiloscritta e citava i commi specifici. Mi ha indicato l'articolo esatto sulla temperatura del lavandino di servizio, capitolo e sezione. Ha nominato la stuccatura e la fessura della porta usando i termini tecnici prima che io avessi messo piede dentro, come se stesse leggendo una lista di controllo tratta dal mio manuale. Ha definito la cella frigorifera "la camera fredda", come fosse un nome proprio, e il lavandino di servizio "il lavandino Hobart". Chiunque l'abbia scritta sapeva per cosa viene verbalizzata una cucina commerciale, lo sapeva alla perfezione e sapeva esattamente dove un vecchio edificio presenta i suoi punti deboli.» Aprì la porta sul freddo. «Di solito chi conosce così bene il regolamento non è la persona che presenta l'esposto. Di solito ha una cucina propria a cui badare.»</w:t>
       </w:r>
     </w:p>
     <w:p>
@@ -2868,7 +2868,7 @@
     </w:p>
     <w:p>
       <w:r>
-        <w:t>Non Greta. Era troppo vicina alla questione per vederla, e troppo vulnerabile. Non la contea, il cui incaricato era già stato mandato per farla chiudere, non per aiutarla. Volevo un occhio semplice e onesto e un banco sotto cui mettere la farina. A Frost Falls ce n'erano esattamente uno per tipo, in fondo a una stradina che si staccava da Maple, dove Doc Mitchell teneva il suo studio.</w:t>
+        <w:t xml:space="preserve">Non Greta. Era troppo vicina alla questione per vederla, e troppo vulnerabile. Non la contea, il cui incaricato era già stato mandato per farla chiudere, non per aiutarla. Volevo un occhio semplice e onesto e un banco su cui esaminare la farina. A Frost Falls ce n'erano esattamente uno per tipo, in fondo a una stradina che si staccava da Maple, dove Doc Mitchell teneva il suo studio.</w:t>
       </w:r>
     </w:p>
     <w:p>
@@ -4078,7 +4078,7 @@
     </w:p>
     <w:p>
       <w:r>
-        <w:t>La stuccatura. Le guarnizioni. Il lavandino di servizio a due gradi sotto la soglia, per colpa di un vecchio tubo. Aveva nominato tutte e tre le cose in ordine, con i termini del mestiere, esattamente come Varney le aveva lette dalla sua lista di controllo. Esattamente come l'esposto dattiloscritto le aveva elencate prima ancora che quell'uomo mettesse piede nel negozio di Greta.</w:t>
+        <w:t xml:space="preserve">La stuccatura. La guarnizione. Il lavandino di servizio a due gradi sotto la soglia consentita, per colpa di un vecchio tubo. Aveva nominato tutte e tre le cose in ordine, con i termini del mestiere, esattamente come Varney le aveva lette dalla sua lista di controllo. Esattamente come l'esposto dattiloscritto le aveva elencate prima ancora che quell'uomo mettesse piede nel negozio di Greta.</w:t>
       </w:r>
     </w:p>
     <w:p>
@@ -4440,7 +4440,7 @@
     <w:p/>
     <w:p>
       <w:r>
-        <w:t>«Acido ascorbico ed enzimi» disse. «Un pizzico ogni ventitré chili. Miglioratore per impasti.» Rimise il coperchio al suo posto. «Non è quello che c'era nella farina di Greta. Un mastello di base acida, lo sentiresti appena tolto il coperchio. Tagliente, come aceto. Niente in questa stanza odora così.»</w:t>
+        <w:t xml:space="preserve">«Acido ascorbico ed enzimi» disse. «Un pizzico ogni ventitré chili. Miglioratore per impasti.» Rimise il coperchio al suo posto. «Non è quello che c'era nella farina di Greta. Un mastello di base acida, lo si sentirebbe appena tolto il coperchio. Tagliente, come aceto. Niente in questa stanza odora così.»</w:t>
       </w:r>
     </w:p>
     <w:p/>
@@ -4488,7 +4488,7 @@
     <w:p/>
     <w:p>
       <w:r>
-        <w:t>«La stuccatura? Me lo ha detto Joyce Wendt. Lavorava in quella cucina. Mi ha raccontato anche delle infornate rovinate di Greta, il lunedì in cui sono iniziati, prima che chiunque su questo viale lo sapesse. È entrata e uscita dalla mia cucina da ottobre con dei campioni, cercando di vendermi il pane. E parla del vecchio negozio di Greta come se avesse ancora la chiave.» Riprese il raccoglitore da Doc e lo posò squadrato sul marmo. «Se avessi voluto la clientela di Greta, signora Claus, me la sarei presa con della pasticceria migliore. Ho della pasticceria migliore. C'è qualcos'altro nella mia cucina che vorrebbe annusare, Dottore?»</w:t>
+        <w:t xml:space="preserve">«La stuccatura? Me lo ha detto Joyce Wendt. Lavorava in quella cucina. Mi ha raccontato anche delle infornate rovinate di Greta, il lunedì in cui sono iniziate, prima che chiunque su questo viale lo sapesse. È entrata e uscita dalla mia cucina da ottobre con dei campioni, cercando di vendermi il pane. E parla del vecchio negozio di Greta come se avesse ancora la chiave.» Riprese il raccoglitore da Doc e lo posò squadrato sul marmo. «Se avessi voluto la clientela di Greta, signora Claus, me la sarei presa con della pasticceria migliore. Ho della pasticceria migliore. C'è qualcos'altro nella mia cucina che vorrebbe annusare, Dottore?»</w:t>
       </w:r>
     </w:p>
     <w:p/>
@@ -4572,7 +4572,7 @@
     <w:p/>
     <w:p>
       <w:r>
-        <w:t>E quando aveva fatto il nome di Joyce, avevo perdonato a Joyce in un sol fiato ciò che avevo negato a Renée per una settimana. Certo che Joyce conosceva la stuccatura. Ci aveva lavorato accanto per anni. Mi piaceva Joyce. Era andata a prendere la scopa di Greta e aveva spazzato i vetri e non aveva voluto sentir ringraziamenti, e l'avevo scusata prima che Renée finisse la frase.</w:t>
+        <w:t xml:space="preserve">E quando aveva fatto il nome di Joyce, avevo concesso a Joyce in un sol fiato ciò che avevo negato a Renée per una settimana. Certo che Joyce conosceva la stuccatura. Ci aveva lavorato accanto per anni. Mi piaceva Joyce. Era andata a prendere la scopa di Greta e aveva spazzato i vetri e non aveva voluto sentir ringraziamenti, e l'avevo scusata prima che Renée finisse la frase.</w:t>
       </w:r>
     </w:p>
     <w:p/>
@@ -4647,7 +4647,7 @@
     </w:p>
     <w:p>
       <w:r>
-        <w:t>La scatola sigillata stava al suo posto nella stanza principale, la perdita d'acqua lontana da lì. Era salva di ben due metri scarsi, e fu una grazia. Ma un'altra giuntura e un'altra notte di freddo avrebbero azzerato quella distanza.</w:t>
+        <w:t xml:space="preserve">La scatola sigillata stava al suo posto nella stanza principale, la perdita d'acqua lontana da lì. Era salva per quasi due metri, ed era una grazia. Ma un'altra giuntura e un'altra notte di freddo avrebbero azzerato quella distanza.</w:t>
       </w:r>
     </w:p>
     <w:p>
@@ -4940,7 +4940,7 @@
     </w:p>
     <w:p>
       <w:r>
-        <w:t>«Quello non è cambiato. La sua inaugurazione, stampata proprio per la settimana in cui Greta ha chiuso i battenti, e stampata prima ancora che Varney mettesse piede qui.» Spostai la ciotola di lato. «L'ho letto alla Grange come la prova che sapeva che la chiusura stava arrivando. Non puoi fissare un'inaugurazione su una chiusura che non è ancora avvenuta.»</w:t>
+        <w:t xml:space="preserve">«Quello non è cambiato. La sua inaugurazione, stampata proprio per la settimana in cui Greta ha chiuso i battenti, e stampata prima ancora che Varney mettesse piede da Greta.» Spostai la ciotola di lato. «L'ho letto alla Grange come la prova che sapeva che la chiusura stava arrivando. Non puoi fissare un'inaugurazione su una chiusura che non è ancora avvenuta.»</w:t>
       </w:r>
     </w:p>
     <w:p>
@@ -4970,7 +4970,7 @@
     </w:p>
     <w:p>
       <w:r>
-        <w:t>«È quello che credevo. Poi Doc ha perlustrato il suo magazzino giovedì e non c'era traccia di base acida, e lei mi ha detto chi le aveva parlato della stuccatura di Greta.» Non andai oltre, avendo giurato di evitare i volti per la notte. «Quindi mi rimane la carta. Un volantino è una prova sul banco di qualcuno molto prima che diventi un volantino su una bacheca. Qualcuno lo ha visto lì. Qualcuno ha letto quella settimana da lì e ha scritto un esposto alla contea perché ci cascasse dentro.»</w:t>
+        <w:t xml:space="preserve">«È quello che credevo. Poi Doc ha perlustrato il suo magazzino giovedì e non c'era traccia di base acida, e lei mi ha detto chi le aveva parlato della stuccatura di Greta.» Non andai oltre, avendo giurato di evitare i volti per la notte. «Quindi mi rimane la carta. Un volantino è una bozza sul banco di qualcuno molto prima che diventi un volantino su una bacheca. Qualcuno lo ha visto lì. Qualcuno ha letto quella settimana da lì e ha scritto un esposto alla contea perché arrivasse proprio in quella settimana.»</w:t>
       </w:r>
     </w:p>
     <w:p>
@@ -5211,7 +5211,7 @@
     </w:p>
     <w:p>
       <w:r>
-        <w:t>«Due.» Non dovette fermarsi a pensare. «Una è sul mio mazzo. L'altra era su quello di Joyce. Ha posato la chiave del negozio su questo bancone il giorno in cui se n'è andata, e io non ho mai pensato alla chiave del cancello. È lo stesso lucchetto che sta su quel cancello da quando l'ha montato Harold. Non l'ho mai cambiata.» Mi guardò. «Perché avrei dovuto? Aveva preso i suoi soldi ed era andata a Bridgton. Che diavolo se ne faceva del mio cancello?»</w:t>
+        <w:t xml:space="preserve">«Due.» Non dovette fermarsi a pensare. «Una è sul mio mazzo. L'altra era su quello di Joyce. Ha posato la chiave del negozio su questo bancone il giorno in cui se n'è andata, e io non ho mai pensato alla chiave del cancello. È lo stesso lucchetto che sta su quel cancello da quando l'ha montato Harold. Non l'ho mai cambiato.» Mi guardò. «Perché avrei dovuto? Aveva preso i suoi soldi ed era andata a Bridgton. Che diavolo se ne faceva del mio cancello?»</w:t>
       </w:r>
     </w:p>
     <w:p>
@@ -5251,7 +5251,7 @@
     </w:p>
     <w:p>
       <w:r>
-        <w:t>«Avevo ventitré anni» disse Greta. «Joyce non era molto più grande. Eravamo noi due, con le ricette di mia madre e un prestito dello zio di Joyce e questo edificio con il tetto che perdeva sopra la cella di lievitazione. Lei faceva il pane e io i dolci. È sempre stata più brava di me a fare il pane. Non gliel'ho mai detto. Avrei dovuto dirlo.» Girò una pagina del registro degli ordini e la riportò indietro. «Quindici anni. Ero al suo matrimonio. Ha preso in braccio il mio primo bambino prima di Harold, perché Harold era fuori nel parcheggio a sentirsi male. Tutti quegli anni in questa cucina, alle quattro del mattino ogni singolo giorno, e poi i soldi e gli avvocati, e il nome sopra la porta, e…» Si fermò. «E la torta. Tutti in due contee hanno sentito parlare della torta. Non ho intenzione di parlare della torta.»</w:t>
+        <w:t xml:space="preserve">«Avevo ventitré anni» disse Greta. «Joyce non era molto più grande. Eravamo noi due, con le ricette di mia madre e un prestito dello zio di Joyce e questo edificio con il tetto che perdeva sopra la cella di lievitazione. Lei faceva il pane e io i dolci. È sempre stata più brava di me a fare il pane. Non gliel'ho mai detto. Avrei dovuto dirglielo.» Girò una pagina del registro degli ordini e la riportò indietro. «Quindici anni. Ero al suo matrimonio. Ha preso in braccio il mio primo bambino prima di Harold, perché Harold era fuori nel parcheggio a sentirsi male. Tutti quegli anni in questa cucina, alle quattro del mattino ogni singolo giorno, e poi i soldi e gli avvocati, e il nome sopra la porta, e…» Si fermò. «E la torta. Tutti in due contee hanno sentito parlare della torta. Non ho intenzione di parlare della torta.»</w:t>
       </w:r>
     </w:p>
     <w:p>
@@ -5525,7 +5525,7 @@
     </w:p>
     <w:p>
       <w:r>
-        <w:t>«Doc ha trovato una base acida nella farina di Greta» dissi. «Quella che i panifici comprano per la segale. Un forno di Bridgton ha chiamato i clienti di Greta chiamandoli per nome, offrendosi di prendere in carico i loro ordini per la Holly Jolly. E la società che ha scritto ad agosto per comprare la quota di Greta è intestata alla donna che possiede quel forno.» Trassi un respiro prima dell'unica domanda per cui avevo chiamato. «Riesci a scoprire se Pelkey's di Lewiston ha consegnato una base acida al Wendt's Bakehouse questo autunno?»</w:t>
+        <w:t xml:space="preserve">«Doc ha trovato una base acida nella farina di Greta» dissi. «Quella che i panifici comprano per la segale. Un forno di Bridgton ha telefonato ai clienti di Greta chiamandoli per nome, offrendosi di prendere in carico i loro ordini per la Holly Jolly. E la società che ha scritto ad agosto per comprare la quota di Greta è intestata alla donna che possiede quel forno.» Trassi un respiro prima dell'unica domanda per cui avevo chiamato. «Riesci a scoprire se Pelkey's di Lewiston ha consegnato una base acida al Wendt's Bakehouse questo autunno?»</w:t>
       </w:r>
     </w:p>
     <w:p>
@@ -5720,7 +5720,7 @@
     </w:p>
     <w:p>
       <w:r>
-        <w:t>«L'esposto definiva la cella frigorifera "la camera fredda" e il lavandino di servizio "il lavandino Hobart". Greta dice che nessuno li chiama così dai tempi di Joyce. Il lucchetto del cancello del cortile non è mai stato cambiato, e Pete dice che continua a staccarsi. E l'inacidimento è cessato la mattina in cui Greta ha iniziato a sprangare la sua porta sul retro dopo il mattone, quindi chiunque l'abbia fatto entrava da quella via. Ha visto un furgone vicino alla farmacia prima dell'alba, a fari spenti, non quello del fornitore di carne. Ieri ha guardato la stampa del furgone dei Wendt fatta da Claire e ha detto: "È quello".»</w:t>
+        <w:t xml:space="preserve">«L'esposto definiva la cella frigorifera "la camera fredda" e il lavandino di servizio "il lavandino Hobart". Greta dice che nessuno li chiama così dai tempi di Joyce. Il lucchetto del cancello del cortile non è mai stato cambiato, e Pete dice che continua a staccarsi. E l'inacidimento è cessato la mattina in cui Greta ha iniziato a sprangare la sua porta sul retro dopo il mattone, quindi chiunque l'abbia fatto entrava da quella via. Pete ha visto un furgone vicino alla farmacia prima dell'alba, a fari spenti, non quello del fornitore di carne. Ieri ha guardato la stampa del furgone dei Wendt fatta da Claire e ha detto: "È quello".»</w:t>
       </w:r>
     </w:p>
     <w:p>
@@ -5785,7 +5785,7 @@
     </w:p>
     <w:p>
       <w:r>
-        <w:t>Tanaka mi guardò sopra il taccuino un momento più del necessario. «Quindi qualcuno voleva che puntasse verso l'alto del viale.» Scrisse anche quello.</w:t>
+        <w:t xml:space="preserve">Tanaka mi guardò sopra il taccuino un momento più del necessario. «Quindi qualcuno voleva che puntasse verso l'altra estremità del viale.» Scrisse anche quello.</w:t>
       </w:r>
     </w:p>
     <w:p>
@@ -5925,7 +5925,7 @@
     </w:p>
     <w:p>
       <w:r>
-        <w:t>La voce nell'apparecchio salì leggermente. Colsi il nome di Greta in essa, e "certamente", e «qualsiasi cosa le serva.»</w:t>
+        <w:t xml:space="preserve">La voce nell'apparecchio salì leggermente. Colsi il nome di Greta in essa, e "certamente", e "qualsiasi cosa le serva".</w:t>
       </w:r>
     </w:p>
     <w:p>
@@ -6040,7 +6040,7 @@
     <w:p/>
     <w:p>
       <w:r>
-        <w:t>«L'esposto alla contea definiva la sua cella frigorifera "la camera fredda" e il suo lavandino di servizio "il lavandino Hobart". Greta dice che nessuno li chiama così dai tempi suoi.»</w:t>
+        <w:t xml:space="preserve">«L'esposto alla contea definiva la sua cella frigorifera "la camera fredda" e il suo lavandino di servizio "il lavandino Hobart". Greta dice che nessuno li chiama così da quando c'era lei.»</w:t>
       </w:r>
     </w:p>
     <w:p/>
@@ -6136,7 +6136,7 @@
     <w:p/>
     <w:p>
       <w:r>
-        <w:t>«Va bene» disse. «Volete sapere il perché. Lei sa perché.» Guardò Greta dall'altra parte del tavolo. «Quella torta era mia.»</w:t>
+        <w:t xml:space="preserve">«Va bene» disse. «Volete sapere il perché. Greta sa perché.» Guardò Greta dall'altra parte del tavolo. «Quella torta era mia.»</w:t>
       </w:r>
     </w:p>
     <w:p/>
@@ -6274,7 +6274,7 @@
     <w:p/>
     <w:p>
       <w:r>
-        <w:t>«Ora le servirà un avvocato, signora Wendt» disse, non senza gentilezza. «È un suo diritto, e al suo posto lo farei. Ma sarò chiara su questo punto, così nessuno potrà fare confusione in seguito. Quello che ho qui è la documentazione di un fornitore con la sua firma sopra, la perizia di un chimico, un registro statale, un uomo che riconosce il suo furgone e due donne a cui il suo panificio ha telefonato con ordinazioni tratte da un registro che lei non aveva alcun diritto di leggere. Tutto messo per iscritto. Niente di tutto ciò richiede che lei ammetta alcunché.» Posò la penna. «Qualsiasi cosa di cui si penta questo pomeriggio, e credo che ce ne sia qualcuna, non cambia una sola parola su questa pagina. Oggi stessa le verrà mossa un'accusa formale. Chiami il suo avvocato, torni qui con lui entro le sei e sbrigheremo il resto in silenzio.»</w:t>
+        <w:t xml:space="preserve">«Ora le servirà un avvocato, signora Wendt» disse, non senza gentilezza. «È un suo diritto, e al suo posto lo farei. Ma sarò chiara su questo punto, così nessuno potrà fare confusione in seguito. Quello che ho qui è la documentazione di un fornitore con la sua firma sopra, la perizia di un chimico, un registro statale, un uomo che riconosce il suo furgone e due donne a cui il suo panificio ha telefonato con ordinazioni tratte da un registro che lei non aveva alcun diritto di leggere. Tutto messo per iscritto. Niente di tutto ciò richiede che lei ammetta alcunché.» Posò la penna. «Qualsiasi cosa di cui si penta questo pomeriggio, e credo che ce ne sia qualcuna, non cambia una sola parola su questa pagina. Oggi stessa le verrà mossa un'accusa formale. Chiami il suo avvocato, torni qui con lui entro le sei e sbrigheremo il resto con discrezione.»</w:t>
       </w:r>
     </w:p>
     <w:p/>
@@ -6347,7 +6347,7 @@
     </w:p>
     <w:p>
       <w:r>
-        <w:t>La cosa era stata gestita con discrezione, come aveva detto che sarebbe stato. Nessuna sala pubblica. Nessuna folla. Aveva recuperato lei stessa il mio barattolo di farina dal mobile chiuso a chiave di Doc, con il suo biglietto firmato accanto, e aveva preso da parte Danny con garbo, mettendo nero su bianco ogni singolo passaggio.</w:t>
+        <w:t xml:space="preserve">La cosa era stata gestita con discrezione, come aveva detto che sarebbe stato. Nessuna sala pubblica. Nessuna folla. Aveva recuperato lei stessa il mio barattolo di farina dal mobile chiuso a chiave di Doc, con il suo biglietto firmato accanto, e aveva raccolto con garbo, in disparte, la testimonianza di Danny, mettendo nero su bianco ogni singolo passaggio.</w:t>
       </w:r>
     </w:p>
     <w:p>
@@ -6412,7 +6412,7 @@
     </w:p>
     <w:p>
       <w:r>
-        <w:t>«Non in quello che ha trovato. Una base acida è un alimento. Rovina solo l'impasto sbagliato.» Chiuse il taccuino. «L'ospedale però non aspetta i tempi della giustizia. Il responsabile del servizio di refezione mi ha telefonato non appena ho aperto la porta, per chiedermi se fosse vero. Le ho detto ciò che è pubblico, le accuse e la data del processo, e ha sospeso il contratto. L'ispettore sostiene che due locande abbiano chiamato il suo autista prima ancora che avesse finito di caricare il furgone. Ha guardato l'autista riportare dentro il pane.»</w:t>
+        <w:t xml:space="preserve">«Non che lui abbia trovato. Una base acida è un alimento. Rovina solo l'impasto sbagliato.» Chiuse il taccuino. «L'ospedale però non aspetta i tempi della giustizia. La responsabile del servizio di refezione mi ha telefonato non appena ho aperto la porta, per chiedermi se fosse vero. Le ho detto ciò che è pubblico, le accuse e la data del processo, e ha sospeso il contratto. L'ispettore sostiene che due locande abbiano chiamato il suo autista prima ancora che avesse finito di caricare il furgone. Ha guardato l'autista riportare dentro il pane.»</w:t>
       </w:r>
     </w:p>
     <w:p>
@@ -6518,7 +6518,7 @@
     </w:p>
     <w:p>
       <w:r>
-        <w:t>Nick aveva acceso la stufa a legna nel laboratorio quando tornai a casa, e una teiera fumante troneggiava sul banco accanto al pattino di una slitta che stava modellando. Pip si diresse verso il focolare in pietra grezza, dove un piattino di latterini la stava aspettando, e si mise all'opera.</w:t>
+        <w:t xml:space="preserve">Nick aveva acceso la stufa a legna nell'officina quando tornai a casa, e una teiera fumante troneggiava sul banco accanto al pattino di una slitta che stava modellando. Pip si diresse verso il focolare in pietra grezza, dove un piattino di latterini la stava aspettando, e si mise all'opera.</w:t>
       </w:r>
     </w:p>
     <w:p>
@@ -6528,7 +6528,7 @@
     </w:p>
     <w:p>
       <w:r>
-        <w:t>«Stavolta è diverso dall'ultima» disse.</w:t>
+        <w:t xml:space="preserve">«Stavolta è diverso dall'ultima volta» disse.</w:t>
       </w:r>
     </w:p>
     <w:p>

</xml_diff>

<commit_message>
Full proofcheck Flour Play Italian: SIGNIFICANT (108 fixes)
Co-Authored-By: Claude Opus 5.5 <noreply@anthropic.com>
Claude-Session: https://claude.ai/code/session_012Cm8JxdqzjuttdUSdkQCUg
</commit_message>
<xml_diff>
--- a/translated/corrected/Flour Play - ASSEMBLED - FORMATTED_Italian.docx
+++ b/translated/corrected/Flour Play - ASSEMBLED - FORMATTED_Italian.docx
@@ -263,7 +263,7 @@
     <w:p/>
     <w:p>
       <w:r>
-        <w:t xml:space="preserve">«Qualcuno deve pur farlo. Voi non lo farete di certo da sole.» Stava già sollevando il coperchio. L'odore uscì e si mescolò all'abete nel mezzo della stanza, cioccolato e zucchero di canna sovrapposti al pino verde e freddo. Pensai che fosse quanto di più vicino all'odore dell'intera stagione in arrivo avessi mai conosciuto. «E ci sono biscottini allo zenzero sul fondo, quindi non fate che prendervi solo i muffin e lasciare i biscotti, Dot, ti ho vista farlo alla Grange e non me ne sono dimenticata.»</w:t>
+        <w:t xml:space="preserve">«Qualcuno deve pur farlo. Voi non lo farete di certo da sole.» Stava già sollevando il coperchio. L'odore uscì e si mescolò all'abete nel mezzo della stanza, cioccolato e zucchero di canna sovrapposti al pino verde e freddo. Pensai che fosse quanto di più vicino all'odore dell'intera stagione in arrivo avessi mai conosciuto. «E ci sono biscottini allo zenzero sul fondo, quindi non prenderti solo i muffin lasciando lì i biscotti, Dot, ti ho vista farlo alla Grange e non me ne sono dimenticata.»</w:t>
       </w:r>
     </w:p>
     <w:p/>
@@ -317,7 +317,7 @@
     <w:p/>
     <w:p>
       <w:r>
-        <w:t>Questo distolse l'attenzione del circolo dal fil di ferro. Il vecchio locale dei Fenwick era rimasto vuoto per un bel po', con le finestre scure in fondo a un blocco luminoso. Era quel genere di vuoto in una fila di negozi che la gente impara a non guardare, per non avvertire quella piccola fitta.</w:t>
+        <w:t>Questo distolse l'attenzione del circolo dal fil di ferro. Il vecchio locale dei Fenwick era rimasto vuoto per un anno buono, con le finestre scure in fondo a un blocco luminoso. Era quel genere di vuoto in una fila di negozi che la gente impara a non guardare, per non avvertire quella piccola fitta.</w:t>
       </w:r>
     </w:p>
     <w:p/>
@@ -365,7 +365,7 @@
     <w:p/>
     <w:p>
       <w:r>
-        <w:t>Il prato sorgeva di fronte a Yarn Tales, un ampio spazio verde con il monumento ai caduti in cima e il grande olmo all'estremità lontana. Gli scolari ne avevano costruito una fila durante la neve di Halloween. Tre pupazzi, grassi e sbilenchi, incoronati con qualunque cosa i ragazzi fossero riusciti a rimediare. Ieri, come diceva Ellie, erano rivolti verso la strada, con gli occhi di carbone e aria socievole, a guardare il traffico scorrere come fanno i pupazzi di neve. C'ero passata davanti anch'io la sera prima. Avevano la faccia rivolta verso la strada.</w:t>
+        <w:t>Il prato sorgeva di fronte a Yarn Tales, un ampio spazio verde con il monumento ai caduti in cima e il grande olmo all'estremità lontana. Gli scolari vi avevano costruito una fila di pupazzi di neve durante la neve di Halloween. Tre pupazzi, grassi e sbilenchi, incoronati con qualunque cosa i ragazzi fossero riusciti a rimediare. Ieri, come diceva Ellie, erano rivolti verso la strada, con gli occhi di carbone e aria socievole, a guardare il traffico scorrere come fanno i pupazzi di neve. C'ero passata davanti anch'io la sera prima. Avevano la faccia rivolta verso la strada.</w:t>
       </w:r>
     </w:p>
     <w:p/>
@@ -377,7 +377,7 @@
     <w:p/>
     <w:p>
       <w:r>
-        <w:t>Se ne stava ora con le spalle alla strada, le braccia di rametti spalancate ai lati, la faccia di carbone tozza rivolta in alto verso il prato in direzione dei negozi. Verso, a voler essere precisi, l'estremità del blocco dove il vecchio locale dei Fenwick si trovava dietro la sua carta marrone. Gli altri due guardavano ancora la strada. Solo quello di mezzo si era mosso. Girato di scatto sulla propria base per guardare dall'altra parte. E non c'era un'impronta di scarpa nei dintorni. La neve tutt'intorno a tutti e tre giaceva liscia e intatta. Quindici centimetri di fresca nevicata notturna, senza null'altro inciso sopra se non la lunga ombra blu del monumento ai caduti.</w:t>
+        <w:t>Se ne stava ora con le spalle alla strada, le braccia di rametti spalancate ai lati, la faccia di carbone tozza rivolta in alto verso il prato in direzione dei negozi. Verso, a voler essere precisi, l'estremità del blocco dove il vecchio locale dei Fenwick si trovava dietro la sua carta marrone. Gli altri due guardavano ancora la strada. Solo quello di mezzo si era mosso. Girato tutto intero sulla propria base per guardare dall'altra parte. E non c'era un'impronta di scarpa nei dintorni. La neve tutt'intorno a tutti e tre giaceva liscia e intatta. Quindici centimetri di fresca nevicata notturna, senza null'altro inciso sopra se non la lunga ombra blu del monumento ai caduti.</w:t>
       </w:r>
     </w:p>
     <w:p/>
@@ -646,7 +646,7 @@
     <w:p/>
     <w:p>
       <w:r>
-        <w:t>Quando uscii su Evergreen Avenue, la porta si chiuse alle spalle mia e di Pip, e rimasi un istante nel freddo pulito, guardando l'insegna HOLLY JOLLY BAKERY scritta in oro sul vetro. All'interno, Greta girò il cartello sulla porta su CHIUSO e cominciò a spegnere le luci.</w:t>
+        <w:t>Quando uscii su Evergreen Avenue, la porta si chiuse alle spalle mie e di Pip, e rimasi un istante nel freddo pulito, guardando l'insegna HOLLY JOLLY BAKERY scritta in oro sul vetro. All'interno, Greta girò il cartello sulla porta su CHIUSO e cominciò a spegnere le luci.</w:t>
       </w:r>
     </w:p>
     <w:p>
@@ -662,7 +662,7 @@
     </w:p>
     <w:p>
       <w:r>
-        <w:t>Lo seppi per prima da Kelly. Ero sulla via del ritorno da Greta insieme a Pip quando lei mi prese per il gomito fuori dallo Starlight Café e mi tirò dentro per ripararmi dal freddo. Era chiaro che teneva quella notizia in serbo fin dalla colazione. Il locale era caldo e sapeva di caffè e carta vecchia, quel buon odore asciutto di una stanza piena di libri. Kelly aveva uno straccio in mano e un'espressione sul viso che non riuscii a collocare subito, cosa rara per Kelly.</w:t>
+        <w:t>La prima a dirmelo fu Kelly. Ero sulla via del ritorno da Greta insieme a Pip quando lei mi prese per il gomito fuori dallo Starlight Café e mi tirò dentro per ripararmi dal freddo. Era chiaro che teneva quella notizia in serbo fin dalla colazione. Il locale era caldo e sapeva di caffè e carta vecchia, quel buon odore asciutto di una stanza piena di libri. Kelly aveva uno straccio in mano e un'espressione sul viso che non riuscii a collocare subito, cosa rara per Kelly.</w:t>
       </w:r>
     </w:p>
     <w:p>
@@ -672,12 +672,12 @@
     </w:p>
     <w:p>
       <w:r>
-        <w:t>«Non mi sono spinta fin là su stamattina.»</w:t>
-      </w:r>
-    </w:p>
-    <w:p>
-      <w:r>
-        <w:t>«Beh, ti andrà di farlo.» Strofinò un bancone che non aveva bisogno di essere strofinato. «Una pasticceria, Jessica. Non un panificio. Una pasticceria. C'è una differenza, mi dicono, e immagino che ce lo ripeteranno tutti.» Lo disse con leggerezza, ma non sorrise.</w:t>
+        <w:t>«Non mi sono spinta fin lassù stamattina.»</w:t>
+      </w:r>
+    </w:p>
+    <w:p>
+      <w:r>
+        <w:t>«Beh, ti andrà di farlo.» Strofinò un bancone che non aveva bisogno di essere strofinato. «Una pasticceria, Jessica. Non una panetteria. Una pasticceria. C'è una differenza, mi dicono, e immagino che ce lo ripeteranno tutti.» Lo disse con leggerezza, ma non sorrise.</w:t>
       </w:r>
     </w:p>
     <w:p>
@@ -725,7 +725,7 @@
     </w:p>
     <w:p>
       <w:r>
-        <w:t>Aveva forse cinquant'anni, e li portava bene. I suoi capelli scuri erano tirati indietro senza un solo ciuffo fuori posto, nonostante il vento che aveva soffiato i capelli negli occhi di chiunque per tutta la mattina. I suoi abiti erano semplici e costosi. Accanto a lei mi resi conto della farina che probabilmente mi ero portata dietro da Greta, e ebbi la sensazione che l'avesse notata per prima.</w:t>
+        <w:t>Aveva forse cinquant'anni, e li portava bene. I suoi capelli scuri erano tirati indietro senza un solo ciuffo fuori posto, nonostante il vento che aveva soffiato i capelli negli occhi di chiunque per tutta la mattina. I suoi abiti erano semplici e costosi. Accanto a lei mi resi conto della farina che probabilmente mi ero portata dietro da Greta, ed ebbi la sensazione che l'avesse notata per prima.</w:t>
       </w:r>
     </w:p>
     <w:p>
@@ -735,7 +735,7 @@
     </w:p>
     <w:p>
       <w:r>
-        <w:t>«Non è perfetto?» Si voltò ad abbracciare con lo sguardo il viale e le sue vetrine dalle lettere d'oro, e lo ispezionò con il piacere di chi colleziona. «Nel momento in cui ho visto le fotografie ho capito. C'è più denaro di Natale in questo paese di quanto chiunque qui sembri rendersi conto. Tutti questi negozietti deliziosi, e nemmeno una vera pasticceria in mezzo. Stentavo a crederci.»</w:t>
+        <w:t>«Non è perfetto?» Si voltò ad abbracciare con lo sguardo il viale e le sue vetrine dalle lettere d'oro, e lo ispezionò con il piacere di chi colleziona. «Nel momento in cui ho visto le fotografie ho capito. C'è più denaro di Natale in questo paese di quanto chiunque qui sembri rendersene conto. Tutti questi negozietti deliziosi, e nemmeno una vera pasticceria in mezzo. Stentavo a crederci.»</w:t>
       </w:r>
     </w:p>
     <w:p>
@@ -755,7 +755,7 @@
     </w:p>
     <w:p>
       <w:r>
-        <w:t>«Solo quello che si sente.» Renée allargò le sue mani fredde, grondanti simpatia. «La sua porta è rimasta chiusa tutta la mattina, e la gente del pane dice che ha avuto un brutto periodo. Infornate che vanno male, quel genere di spiacevolezza. Le sono davvero vicina.» Scosse la testa. «Anche se glielo dico io, in questo lavoro, una volta che il nome di una cucina viene messo in discussione» mi guardò, franca e addolorata, una professionista che si confida con un'amica, «la gente parla, non è vero? Non è giusto, ma tant'è. Una panetteria vive del suo nome. Lasci entrare un dubbio ed è un diavolo farlo uscire.» Sorrise. «Ma mi ascolti, a parlare di lavoro quando è venuta solo per salutare. Entri. Voglio farle vedere i forni.»</w:t>
+        <w:t>«Solo quello che si sente.» Renée allargò le sue mani fredde, grondanti simpatia. «La sua porta è rimasta chiusa tutta la mattina, e la gente del pane dice che ha avuto un brutto periodo. Infornate che vanno male, quel genere di spiacevolezza. Le sono davvero vicina.» Scosse la testa. «Anche se glielo dico io, in questo lavoro, una volta che il nome di una cucina viene messo in discussione» mi guardò, franca e addolorata, una professionista che si confida con un'amica, «la gente parla, non è vero? Non è giusto, ma tant'è. Una panetteria vive del suo nome. Lasci entrare un dubbio ed è un'impresa farlo uscire.» Sorrise. «Ma mi ascolti, a parlare di lavoro quando è venuta solo per salutare. Entri. Voglio farle vedere i forni.»</w:t>
       </w:r>
     </w:p>
     <w:p>
@@ -935,13 +935,13 @@
     <w:p/>
     <w:p>
       <w:r>
-        <w:t>Tornai alla Holly Jolly la mattina dopo e trovai Greta a lavorare, nonostante le avessi detto di riposare. Aveva rimesso a nuovo la parte anteriore da cima a fondo. Il pavimento era tirato a lucido e le vetrine pulite ed erano vuote. Greta era immersa fino ai gomiti in un nuovo impasto, avendo deciso di provare il forno ancora una volta.</w:t>
-      </w:r>
-    </w:p>
-    <w:p/>
-    <w:p>
-      <w:r>
-        <w:t>«Un'altra infornata» disse, prima che io avessi chiuso la porta. «L'ho fatta con calma. Ho pesato tutto due volte su una bilancia che ho preso in prestito da Hal, nel caso la mia fosse starata. Farina nuova presa da un sacco che ho aperto alle quattro e lasciato vicino alla porta del retrobottega mentre i forni si scaldavano. Non nel bidone. Se questo viene fuori come si deve, allora gli ultimi giorni sono stati una specie di malocchio nell'aria, e mi riprenderò la mia stagione, e non ne parleremo mai più.»</w:t>
+        <w:t>Tornai alla Holly Jolly la mattina dopo e trovai Greta a lavorare, nonostante le avessi detto di riposare. Aveva rimesso a nuovo la parte anteriore da cima a fondo. Il pavimento era tirato a lucido e le vetrine pulite e vuote. Greta era immersa fino ai gomiti in un nuovo impasto, avendo deciso di provare il forno ancora una volta.</w:t>
+      </w:r>
+    </w:p>
+    <w:p/>
+    <w:p>
+      <w:r>
+        <w:t>«Un'altra infornata» disse, prima che io avessi chiuso la porta. «L'ho fatta con calma. Ho pesato tutto due volte su una bilancia che ho preso in prestito da Hal, nel caso la mia fosse starata. Farina nuova presa da un sacco che ho aperto alle quattro e lasciato vicino alla porta del retrobottega mentre i forni si scaldavano. Non quella del bidone. Se questo viene fuori come si deve, allora gli ultimi giorni sono stati una specie di malocchio nell'aria, e mi riprenderò la mia stagione, e non ne parleremo mai più.»</w:t>
       </w:r>
     </w:p>
     <w:p/>
@@ -1001,7 +1001,7 @@
     <w:p/>
     <w:p>
       <w:r>
-        <w:t>Seppi della vetrata da Claire, che telefonò la mattina dopo prima che avessi finito il caffè.</w:t>
+        <w:t>Seppi della vetrina da Claire, che telefonò la mattina dopo prima che avessi finito il caffè.</w:t>
       </w:r>
     </w:p>
     <w:p/>
@@ -1097,7 +1097,7 @@
     <w:p/>
     <w:p>
       <w:r>
-        <w:t>Hal Thompson risalì il blocco quasi di corsa, ancora con il grembiule da droghiere addosso. Diede un'occhiata alla vetrina e una a Greta e non sprecò fiato. Tornò a prendere il furgone e tornò con il pannello di compensato che teneva da parte per la stagione delle tempeste e il suo buon trapano.</w:t>
+        <w:t>Hal Thompson risalì il blocco quasi di corsa, ancora con il grembiule da droghiere addosso. Diede un'occhiata alla vetrina e una a Greta e non sprecò fiato. Andò a prendere il camion e tornò con il pannello di compensato che teneva da parte per la stagione delle tempeste e il suo buon trapano.</w:t>
       </w:r>
     </w:p>
     <w:p/>
@@ -1319,7 +1319,7 @@
     <w:p/>
     <w:p>
       <w:r>
-        <w:t>«Le faccia mangiare qualcosa. Quando è sconvolta si dimentica di farlo.» Posò il telefono e tirò fuori un bigliettino da visita con il nome della panetteria, lo girò e scrisse un numero sul retro con grafia quadrata e accurata. «Il vetraio a cui mi rivolgo io. Se lo chiama prima delle dieci, le taglia un vetro di quelle dimensioni per venerdì. Gli dica che la mando io, così non rincarerà il conto.» Appoggiò il biglietto contro il registratore di cassa.</w:t>
+        <w:t>«Le faccia mangiare qualcosa. Quando è sconvolta si dimentica di farlo.» Posò il telefono e tirò fuori un bigliettino da visita con il nome del suo panificio, lo girò e scrisse un numero sul retro con grafia quadrata e accurata. «Il vetraio a cui mi rivolgo io. Se lo chiama prima delle dieci, le taglia un vetro di quelle dimensioni per venerdì. Gli dica che la mando io, così non rincarerà il conto.» Appoggiò il biglietto contro il registratore di cassa.</w:t>
       </w:r>
     </w:p>
     <w:p/>
@@ -1366,13 +1366,13 @@
     <w:p/>
     <w:p>
       <w:r>
-        <w:t>Quando il circolo si riunì quel pomeriggio da Yarn Tales per la sua seconda giornata delle ghirlande, chiunque lungo il viale aveva già parlato a sufficienza di Greta. Le donne del circolo avevano conservato il resto del fiato per me.</w:t>
-      </w:r>
-    </w:p>
-    <w:p/>
-    <w:p>
-      <w:r>
-        <w:t>Lo capii nel momento in cui entrai sbattendo i piedi. Sei di loro erano chine sui telai come prima, con l'abete e lo stesso barattolo di pigne dorate, ma il negozio si era fatto silenzioso in un modo diverso. Era la quiete delle donne che avevano detto cose serie e avrebbero continuato a dirle non appena la porta avesse smesso di muoversi. Olivia sollevò lo sguardo dalla sedia a capotavola del circolo. «Siediti, Jessica. Siamo tutte sconvolte per la faccenda.»</w:t>
+        <w:t>Quando il circolo si riunì quel pomeriggio da Yarn Tales per la sua seconda giornata delle ghirlande, tutti lungo il viale si erano già mezzo sgolati a parlare di Greta. Le donne del circolo avevano conservato il resto del fiato per me.</w:t>
+      </w:r>
+    </w:p>
+    <w:p/>
+    <w:p>
+      <w:r>
+        <w:t>Lo capii nel momento in cui entrai sbattendo i piedi. Tutte e sei erano chine sui telai come prima, con l'abete e lo stesso barattolo di pigne dorate, ma il negozio si era fatto silenzioso in un modo diverso. Era la quiete delle donne che avevano detto cose serie e avrebbero continuato a dirle non appena la porta avesse smesso di muoversi. Olivia sollevò lo sguardo dalla sedia a capotavola del circolo. «Siediti, Jessica. Siamo tutte sconvolte per la faccenda.»</w:t>
       </w:r>
     </w:p>
     <w:p/>
@@ -1474,7 +1474,7 @@
     <w:p/>
     <w:p>
       <w:r>
-        <w:t>E lo fecero. Io disposi i miei ramoscelli, ascoltai e non restituii nulla.</w:t>
+        <w:t>E lo fecero. Io disposi i miei ramoscelli, ascoltai e non dissi la mia.</w:t>
       </w:r>
     </w:p>
     <w:p/>
@@ -1666,7 +1666,7 @@
     <w:p/>
     <w:p>
       <w:r>
-        <w:t>«Lo faccio sempre» replicò Emma, con la dignità dei suoi otto anni. Agganciò il guinzaglio e disse addio a Pip con più tenerezza di quanta ne riservasse a ciascuna di noi, poi uscì nel pomeriggio azzurro con il cagnolino bianco che le trotterellava orgoglioso accanto, e noi la guardammo allontanarsi.</w:t>
+        <w:t>«Lo faccio sempre» replicò Emma, con la dignità dei suoi otto anni. Agganciò il guinzaglio e salutò Pip con più tenerezza di quanta ne riservasse a ciascuna di noi, poi uscì nel pomeriggio azzurro con il cagnolino bianco che le trotterellava orgoglioso accanto, e noi la guardammo allontanarsi.</w:t>
       </w:r>
     </w:p>
     <w:p/>
@@ -1684,7 +1684,7 @@
     <w:p/>
     <w:p>
       <w:r>
-        <w:t>Al cancello lei si fermò a ispezionare un ghiacciolo caduto dal cornicione del portico, decise che non si trattava di un pesce e riprese la via su per il sentiero.</w:t>
+        <w:t>Al cancello lei si fermò a ispezionare un ghiacciolo caduto dalla ringhiera del portico, decise che non si trattava di un pesce e riprese la via su per il sentiero.</w:t>
       </w:r>
     </w:p>
     <w:p/>
@@ -1701,7 +1701,7 @@
     <w:p/>
     <w:p>
       <w:r>
-        <w:t>La Società Storica di Frost Falls sorgeva in uno stretto edificio di mattoni sulla piazza, con una porta verde e una targa d'ottone. Cento anni di intemperie l'avevano logorato, e la mattina dopo il circolo delle ghirlande, quando salii i suoi gradini di neve fresca, sembrava consumato di un altro centimetro. Un cordone di stucco nuovo correva lungo la base della porta contro gli spifferi. Un secchio stazionava nel vestibolo sotto una chiazza marrone sul soffitto. Non si poteva rimediare prima del disgelo. Arrivata la primavera avremmo saputo se il tetto avrebbe retto un altro inverno o se avrebbe ceduto. Giù in cantina la caldaia emetteva un rumore che nessuna caldaia funzionante avrebbe dovuto fare. Un colpo lungo e irregolare. Poi partì, e su per le scale salì un tepore debole che arrivò circa a metà e non andò oltre.</w:t>
+        <w:t>La Società Storica di Frost Falls sorgeva in uno stretto edificio di mattoni sulla piazza, con una porta verde e una targa d'ottone. Cento anni di intemperie l'avevano logorato, e la mattina dopo il circolo delle ghirlande, quando salii i suoi gradini d'ingresso lasciandomi alle spalle la neve, sembrava consumato di un altro centimetro. Un cordone di stucco nuovo correva lungo la base della porta contro gli spifferi. Un secchio stazionava nel vestibolo sotto una chiazza marrone sul soffitto. Non si poteva rimediare prima del disgelo. Arrivata la primavera avremmo saputo se il tetto avrebbe retto un altro inverno o se avrebbe ceduto. Giù in cantina la caldaia emetteva un rumore che nessuna caldaia funzionante avrebbe dovuto fare. Un colpo lungo e irregolare. Poi partì, e su per le scale salì un tepore debole che arrivò circa a metà e non andò oltre.</w:t>
       </w:r>
     </w:p>
     <w:p/>
@@ -1914,7 +1914,7 @@
     <w:p/>
     <w:p>
       <w:r>
-        <w:t xml:space="preserve">Claire lo sapeva entro l'ora di cena. Due giorni dopo una fotografia del disegno comparve sulla Gazette, da entrambi i lati, i rigidi fondatori ritratti a matita e la grafia fine e marrone. Il titolo diceva LE PAROLE STESSE DI UN FONDATORE, e sotto, più in piccolo: </w:t>
+        <w:t xml:space="preserve">Claire lo sapeva entro l'ora di cena. Due giorni dopo una fotografia del disegno comparve sulla Gazette, da entrambi i lati, i rigidi fondatori ritratti a matita e la grafia fine e marrone. Il titolo diceva LE PAROLE STESSE DI UNA FONDATRICE, e sotto, più in piccolo: </w:t>
       </w:r>
       <w:r>
         <w:rPr>
@@ -1923,7 +1923,7 @@
         <w:t>Frost Falls non fu costruita dai forti. Fu costruita da chi sapeva essere vicino.</w:t>
       </w:r>
       <w:r>
-        <w:t xml:space="preserve"> La gente lo ritagliò. Kelly appese il suo con lo scotch dietro il bancone dello Starlight vicino alla cassa, dove ogni anima che comprava un caffè lo leggeva, perlopiù ad alta voce, e restava in silenzio per un battito subito dopo. Greta, quando le portai il ritaglio nella sua bottega sbarrata, lo lesse due volte, proprio come avevo fatto io. Strinse forte le labbra. «Beh» disse. Solo quello, con la voce di una persona a cui viene ricordato qualcosa nell'ora esatta in cui ne aveva più bisogno. Poi lo appese con lo scotch all'interno della sua finestra scura, rivolto verso l'esterno. Proprio dove la scritta SPORCA era stata lavata via dal tavolato di legno non molto tempo prima.</w:t>
+        <w:t xml:space="preserve"> La gente lo ritagliò. Kelly appese il suo con lo scotch dietro il bancone dello Starlight vicino alla cassa, dove ogni anima che comprava un caffè lo leggeva, perlopiù ad alta voce, e restava in silenzio per un battito subito dopo. Greta, quando le portai il ritaglio nella sua bottega sbarrata, lo lesse due volte, proprio come avevo fatto io. Strinse forte le labbra. «Beh» disse. Solo quello, con la voce di una persona a cui viene ricordato qualcosa nell'ora esatta in cui ne aveva più bisogno. Poi lo appese con lo scotch all'interno della sua finestra scura, rivolto verso l'esterno. Proprio dove la scritta SPORCA era stata lavata via dal rivestimento in legno non molto tempo prima.</w:t>
       </w:r>
     </w:p>
     <w:p/>
@@ -1962,7 +1962,7 @@
     <w:p/>
     <w:p>
       <w:r>
-        <w:t>«Costruisci il barile» dissi. «Io farò dolci per l'occasione e trascinerò Nick a portarlo. E scommetto che anche Greta farà dolci, il giorno in cui i suoi forni torneranno suoi, perché non c'è anima in questa strada che abbia tenuto il suo nome alla finestra per tutto questo tempo senza volere il suo in cambio.» Piegai il suo foglio perfettamente lungo la piega, che era il modo in cui preferiva, e glielo porsi di nuovo. «La Società è ancora in un guaio serio, Hal. Non lasciare che questo bel sentimento ti inganni. La frase di una fondatrice non aggiusterà una caldaia.»</w:t>
+        <w:t>«Costruisci il barile» dissi. «Io farò dolci per l'occasione e trascinerò Nick a portarlo. E scommetto che anche Greta farà dolci, il giorno in cui i suoi forni torneranno suoi, perché non c'è anima in questa strada che abbia tenuto il suo nome alla finestra per tutto questo tempo senza ricevere il suo in cambio.» Piegai il suo foglio perfettamente lungo la piega, che era il modo in cui preferiva, e glielo porsi di nuovo. «La Società è ancora in un guaio serio, Hal. Non lasciare che questo bel sentimento ti inganni. La frase di una fondatrice non aggiusterà una caldaia.»</w:t>
       </w:r>
     </w:p>
     <w:p/>
@@ -1997,12 +1997,12 @@
     <w:p/>
     <w:p>
       <w:r>
-        <w:t>Il giovedì in cui ero stata alla Società, nel tardo pomeriggio e prima che chiudesse, andai da Pete Garcia con un arrosto in mente e i guai di Greta alle spalle. Gli lasciai credere che l'arrosto fosse l'unico scopo della mia commissione.</w:t>
-      </w:r>
-    </w:p>
-    <w:p>
-      <w:r>
-        <w:t>La macelleria di Pete sorgeva dall'altra parte del prato rispetto a Evergreen Avenue, nella fila di negozi che dava sul prato dal lato opposto. La raggiunsi camminando sul sentiero spalato oltre il monumento ai caduti. La sua carne arrivava attraverso il cortile dietro ai negozi di Evergreen, lo stesso cortile della farina di Greta. Non avevo ben considerato, finché non stetti sul suo zerbino con la campanella che ancora dondolava in alto, quanto quel cortile legasse i guai di lui a quelli di lei. Il negozio era caldo. Odorava di carne fredda e pulita e di segatura, e sotto a tutto c'era quel debole acre odore di ferro presente in tutte le macellerie, per quanto strofinate fossero. Pete si trovava dietro il banco con il suo grembiule a righe, massiccio e brizzolato alle tempie. Stava disossando una mezzena con i colpi brevi ed economici di un uomo che l'aveva fatto quarantamila volte. Alzò lo sguardo verso la campanella, vide che ero io e il suo viso si fece guardingo. Era l'espressione di un uomo che aveva scoperto di recente come la gente che varcava la sua porta tendesse a volere sempre la stessa identica cosa da lui.</w:t>
+        <w:t>Il giovedì in cui ero stata alla Società, nel tardo pomeriggio e prima che chiudesse, andai da Pete Garcia con un arrosto in mente e, dietro l'arrosto, i guai di Greta. Gli lasciai credere che l'arrosto fosse l'unico scopo della mia commissione.</w:t>
+      </w:r>
+    </w:p>
+    <w:p>
+      <w:r>
+        <w:t>La macelleria di Pete sorgeva dall'altra parte del prato rispetto a Evergreen Avenue, nella fila di negozi che dava sul prato dal lato opposto. La raggiunsi camminando sul sentiero spalato oltre il monumento ai caduti. La sua carne arrivava attraverso il cortile dietro ai negozi di Evergreen, lo stesso cortile della farina di Greta. Non avevo ben considerato, finché non stetti sul suo zerbino con la campanella che ancora dondolava in alto, quanto quel cortile legasse i guai di lui a quelli di lei. Il negozio era caldo. Odorava di carne fredda e pulita e di segatura, e sotto a tutto c'era quel debole acre odore di ferro presente in tutte le macellerie, per quanto strofinate fossero. Pete si trovava dietro il banco con il suo grembiule a righe, massiccio e brizzolato alle tempie. Stava disossando una mezzena con i colpi brevi ed essenziali di un uomo che l'aveva fatto quarantamila volte. Alzò lo sguardo verso la campanella, vide che ero io e il suo viso si fece guardingo. Era l'espressione di un uomo che aveva scoperto di recente come la gente che varcava la sua porta tendesse a volere sempre la stessa identica cosa da lui.</w:t>
       </w:r>
     </w:p>
     <w:p>
@@ -2017,7 +2017,7 @@
     </w:p>
     <w:p>
       <w:r>
-        <w:t>Ciò lo colpì esattamente dove avevo mirato, e il volto di Pete si distese nel semplice piacere del proprio mestiere. Fece il giro del banco e mise a confronto uno scamone marezzato con la spalla lì accanto, onesto come una bilancia. Poi mi diresse verso il taglio più economico, perché avrebbe svolto il lavoro persino meglio e lui non mi avrebbe venduto qualcosa di costoso quando la scelta economica era quella giusta. Pip, che era entrata al mio seguito e aveva fatto il suo giro sulla segatura nel caso in cui fosse rimasto qualcosa degno dell'attenzione di un pinguino, trovò lo stabilimento tristemente spazzato. Se ne stette presso il bancone con l'aria di un cliente deluso dal servizio.</w:t>
+        <w:t>Ciò lo colpì esattamente dove avevo mirato, e il volto di Pete si distese nel semplice piacere del proprio mestiere. Fece il giro del banco e mise a confronto uno scamone marezzato con la spalla lì accanto, onesto come una bilancia. Poi mi diresse verso il taglio più economico, perché avrebbe svolto il lavoro persino meglio e lui non mi avrebbe venduto qualcosa di costoso quando la scelta economica era quella giusta. Pip, che era entrata al mio seguito e aveva fatto il suo giro sulla segatura nel caso in cui fosse rimasto qualcosa degno dell'attenzione di un pinguino, trovò il locale tristemente spazzato. Se ne stette presso il bancone con l'aria di un cliente deluso dal servizio.</w:t>
       </w:r>
     </w:p>
     <w:p>
@@ -2117,7 +2117,7 @@
     </w:p>
     <w:p>
       <w:r>
-        <w:t xml:space="preserve">«A chi l'avrei dovuto dire?» Allargò le sue grandi mani, amare e sincere. «Al paese che mi ha già etichettato come il colpevole? Dico di aver visto una sagoma alla porta sul retro di Greta, e la prima cosa che esce da ogni bocca è </w:t>
+        <w:t xml:space="preserve">«A chi l'avrei dovuto dire?» Allargò le sue grandi mani, amaro e sincero. «Al paese che mi ha già etichettato come il colpevole? Dico di aver visto una sagoma alla porta sul retro di Greta, e la prima cosa che esce da ogni bocca è </w:t>
       </w:r>
       <w:r>
         <w:rPr>
@@ -2205,7 +2205,7 @@
         <w:t>non è stato lui</w:t>
       </w:r>
       <w:r>
-        <w:t>. In una lunga vita avevo visto più di una persona prosciolta da ogni accusa con molto meno di così, salvo poi scoprire che era stata proprio quella persona a compiere il gesto. La differenza tra quelle due frasi era tutta la mia seccatura. Così non scrissi nessuna delle due nel registro. Portai dentro l'arrosto e lasciai che l'uomo rimanesse esattamente dov'era: né scagionato, né incriminato.</w:t>
+        <w:t>. In una lunga vita avevo visto più di una persona prosciolta da ogni accusa con molto meno di così, salvo poi scoprire che era stata proprio quella persona a compiere il gesto. La differenza tra quelle due frasi era tutto il mio problema. Così non scrissi nessuna delle due nel registro. Portai dentro l'arrosto e lasciai che l'uomo rimanesse esattamente dov'era: né scagionato, né incriminato.</w:t>
       </w:r>
     </w:p>
     <w:p>
@@ -2301,7 +2301,7 @@
     </w:p>
     <w:p>
       <w:r>
-        <w:t>Oltre la farmacia, dove la folla si era ridotta a nulla, un pupazzo di neve se ne stava in disparte da solo. Non era affatto andato sul prato. Era andato dall'altra parte, verso i negozi all'estremità, con le spalle rivolte alla stradina verso cui tutti gli altri pendevano, e la sua faccia grumosa voltata verso la bocca del passaggio che correva dietro di loro. Aveva camminato per ben tre metri lontano dalla compagnia di tutti gli altri, e sotto di esso non c'era alcuna impronta. Se ne stava solo nel freddo con i suoi occhi di carbone fissi sul varco buio tra gli edifici.</w:t>
+        <w:t>Oltre la farmacia, dove la folla si era ridotta a nulla, un pupazzo di neve se ne stava in disparte da solo. Non era affatto andato sul prato. Era andato dall'altra parte, verso i negozi all'estremità, con le spalle rivolte alla stradina verso cui tutti gli altri pendevano, e la sua faccia grumosa voltata verso la bocca del vicolo che correva dietro di loro. Aveva camminato per ben tre metri lontano dalla compagnia di tutti gli altri, e sotto di esso non c'era alcuna impronta. Se ne stava solo nel freddo con i suoi occhi di carbone fissi sul varco buio tra gli edifici.</w:t>
       </w:r>
     </w:p>
     <w:p>
@@ -2333,7 +2333,7 @@
     </w:p>
     <w:p>
       <w:r>
-        <w:t>«Lo so.» Lo disse con dolcezza, senza alcuna sorpresa dentro di sé, soltanto con quella tenera autoironia che un uomo può nutrire per un bambino che ha combinato un guaio enorme e con cui al tempo stesso è impossibile restare arrabbiati. «Ho sentito il passaggio nella notte. Come una corrente tiepida sotto la porta che non dovrebbe esserci.» Mi condusse verso il focolare al centro della stanza. «Vieni a metterti qui vicino. Lo sentirai anche tu, ora che ci fai caso.»</w:t>
+        <w:t>«Lo so.» Lo disse con dolcezza, senza alcuna sorpresa dentro di sé, soltanto con quella tenerezza un po' rassegnata che un uomo può nutrire per un bambino che ha combinato un guaio enorme e con cui al tempo stesso è impossibile restare arrabbiati. «Ho sentito il passaggio nella notte. Come una corrente tiepida sotto la porta che non dovrebbe esserci.» Mi condusse verso il focolare al centro della stanza. «Vieni a metterti qui vicino. Lo sentirai anche tu, ora che ci fai caso.»</w:t>
       </w:r>
     </w:p>
     <w:p>
@@ -2414,7 +2414,7 @@
         <w:t xml:space="preserve">Greta si riprese la vetrina tre giorni dopo il mattone, i vetri e le lettere d'oro, </w:t>
       </w:r>
       <w:r>
-        <w:t>HOLLY JOLLY BAKERY di nuovo composte per intero sulla facciata a opera di Tom della ferramenta. Riaprì le porte quella stessa mattina a un afflusso di clienti che per poco non la commosse. I suoi forni erano tornati a funzionare bene con la stessa inspiegabile stranezza con cui si erano guastati. Dal giorno del mattone aveva tenuto la porta sul retro sprangata mentre infornava, cucina calda o meno, e ogni infornata successiva era uscita perfetta. Se ne stava dietro la vetrinetta riparata, spolverata di farina e raggiante come una lampada. Vendeva biscotti allo zenzero a una fila che usciva sulla porta e ripeteva a gran voce a tutti che non aveva mai dubitato della stagione nemmeno per un istante. Era una bugia. Una bugia deliziosa, e chiunque in strada gliela lasciò passare.</w:t>
+        <w:t>HOLLY JOLLY BAKERY di nuovo composte per intero sulla facciata a opera di Tom della ferramenta. Riaprì le porte quella stessa mattina a un afflusso di clienti che per poco non la fece piangere. I suoi forni erano tornati a funzionare bene con la stessa inspiegabile stranezza con cui si erano guastati. Dal giorno del mattone aveva tenuto la porta sul retro sprangata mentre infornava, cucina calda o meno, e ogni infornata successiva era uscita perfetta. Se ne stava dietro la vetrinetta riparata, spolverata di farina e raggiante come una lampada. Vendeva biscotti allo zenzero a una fila che usciva sulla porta e ripeteva a gran voce a tutti che non aveva mai dubitato della stagione nemmeno per un istante. Era una bugia. Una bugia deliziosa, e chiunque in strada gliela lasciò passare.</w:t>
       </w:r>
       <w:r/>
       <w:r/>
@@ -2541,7 +2541,7 @@
     </w:p>
     <w:p>
       <w:r>
-        <w:t>Greta rimase in piedi davanti al bancone con il foglio giallo sotto le mani. Le mani si erano immobilizzate lì sopra quando lui aveva pronunciato le parole «la camera fredda.» Lo avevo visto da sopra la sua spalla. Lei non disse nulla, e io non chiesi spiegazioni.</w:t>
+        <w:t>Greta rimase in piedi davanti al bancone con il foglio giallo sotto le mani. Le mani si erano immobilizzate lì sopra quando lui aveva pronunciato le parole "la camera fredda". Lo avevo visto da sopra la sua spalla. Lei non disse nulla, e io non chiesi spiegazioni.</w:t>
       </w:r>
     </w:p>
     <w:p>
@@ -2649,7 +2649,7 @@
     <w:p/>
     <w:p>
       <w:r>
-        <w:t>Il nome mi giunse di striscio e a bassa voce. Da qualcuno che non intendeva farsi sentire e che se ne sarebbe vergognato. Mi trovavo da Frosty la mattina dopo, a riempire un sacchetto con la farina che Hal teneva per la gente con i forni spenti, mentre Pip se ne stava davanti alle sardine in scatola in muta supplica. Avevo intenzione di rifare i frollini di Greta nella mia cucina per il barile. Due donne vicino al reparto conserve misero le teste insieme sul prezzo del gasolio. Una pronunciò un nome che non conoscevo. L'altra disse: «Beh, sono così indietro quest'anno, e la gente disperata fa cose disperate.» La prima replicò: «Io non sto dicendo niente.» Si allontanarono lungo il corridoio verso le zuppe, la loro piccola crudeltà rimessa al sicuro fuori dalla vista. Senza sapere di averla lasciata cadere. Senza sapere che l'avevo raccolta io.</w:t>
+        <w:t>Il nome mi giunse di striscio e a bassa voce. Da qualcuno che non intendeva farsi sentire e che se ne sarebbe vergognato. Mi trovavo da Frosty's la mattina dopo, a riempire un sacchetto con la farina che Hal teneva per la gente con i forni spenti, mentre Pip se ne stava davanti alle sardine in scatola in muta supplica. Avevo intenzione di rifare i frollini di Greta nella mia cucina per il barile. Due donne vicino al reparto conserve confabulavano sul prezzo del gasolio. Una pronunciò un nome che non conoscevo. L'altra disse: «Beh, sono così indietro quest'anno, e la gente disperata fa cose disperate.» La prima replicò: «Io non sto dicendo niente.» Si allontanarono lungo il corridoio verso le zuppe, la loro piccola crudeltà rimessa al sicuro fuori dalla vista. Senza sapere di averla lasciata cadere. Senza sapere che l'avevo raccolta io.</w:t>
       </w:r>
     </w:p>
     <w:p>
@@ -2679,7 +2679,7 @@
     </w:p>
     <w:p>
       <w:r>
-        <w:t>«Piano.» Lo disse con un piccolo avvertimento dentro, l'avvertimento di un uomo prudente che custodisce una gentilezza cauta. «Il senso di tutto il barile è che nessuno debba alzarsi alla luce e chiedere. Ma una scatola parte per quella zona del paese una volta alla settimana, e su quale gradino vada ad appoggiarsi non sono affari di nessuno.» Mi guardò, e la timidezza svanì da lui. «Tu puoi entrare nelle case che restano chiuse per il resto di noi. Se volessi vedere di persona quale famiglia la strada ha deciso di temere questa settimana, c'è una scatola che deve essere portata, e io non posso prenderla. Mi conoscono.»</w:t>
+        <w:t>«In silenzio.» Lo disse con un piccolo avvertimento dentro, l'avvertimento di un uomo prudente che custodisce una gentilezza cauta. «Il senso di tutto il barile è che nessuno debba alzarsi alla luce e chiedere. Ma una scatola parte per quella zona del paese una volta alla settimana, e su quale gradino vada ad appoggiarsi non sono affari di nessuno.» Mi guardò, e la timidezza svanì da lui. «Tu puoi entrare nelle case che restano chiuse per il resto di noi. Se volessi vedere di persona quale famiglia la strada ha deciso di temere questa settimana, c'è una scatola che deve essere portata, e io non posso prenderla. Mi conoscono.»</w:t>
       </w:r>
     </w:p>
     <w:p>
@@ -2769,7 +2769,7 @@
     </w:p>
     <w:p>
       <w:r>
-        <w:t>Ma il mattone e la vernice erano la parte rumorosa, e la parte rumorosa era la più piccola. Sotto c'era la farina. Se qualcosa vi era stato messo dentro, dubitavo che provenisse da una dispensa di cucina. Aveva inacidito tre impasti allo stesso modo e aveva continuato ad acidificare dopo che Greta aveva strofinato la sua cucina e aperto nuovo lievito. Qualsiasi cosa avesse fatto una cosa del genere richiedeva competenza: cosa usare, quanto, e come raggiungere un bidone dietro una porta chiusa a chiave. Un Marc Doucette disperato sarebbe stato rumoroso e maldestro. Avrebbe preso ciò che aveva a portata di mano. Non avrebbe condotto una campagna paziente e meticolosa contro un panificio. Sarebbe stato troppo occupato ad avere fame.</w:t>
+        <w:t>Ma il mattone e la vernice erano la parte rumorosa, e la parte rumorosa era la più piccola. Sotto c'era la farina. Se qualcosa vi era stato messo dentro, dubitavo che provenisse da una dispensa di cucina. Aveva inacidito tre impasti allo stesso modo e aveva continuato ad acidificare dopo che Greta aveva strofinato la sua cucina e aperto nuovo lievito. Qualsiasi cosa avesse fatto una cosa del genere richiedeva competenza: cosa usare, quanto, e come raggiungere un bidone dietro una porta chiusa a chiave. Un Marc Doucette disperato sarebbe stato rumoroso e maldestro. Avrebbe preso ciò che aveva a portata di mano. Non avrebbe condotto una campagna paziente e meticolosa contro una panetteria. Sarebbe stato troppo occupato ad avere fame.</w:t>
       </w:r>
     </w:p>
     <w:p>
@@ -2786,7 +2786,7 @@
     <w:p/>
     <w:p>
       <w:r>
-        <w:t>Mi fermai da Frosty sulla via del ritorno per dire a Hal che la scatola era stata consegnata, e trovai la colletta che compiva il suo bene silenzioso proprio lì davanti a me, più chiaramente di qualsiasi discorso. Pip tornò dritta al suo posto davanti alle sardine.</w:t>
+        <w:t>Mi fermai da Frosty's sulla via del ritorno per dire a Hal che la scatola era stata consegnata, e trovai la raccolta che compiva il suo bene silenzioso proprio lì davanti a me, più chiaramente di qualsiasi discorso. Pip tornò dritta al suo posto davanti alle sardine.</w:t>
       </w:r>
     </w:p>
     <w:p>
@@ -2835,7 +2835,7 @@
     </w:p>
     <w:p>
       <w:r>
-        <w:t>«Lo è.» Non mi permisi di fare l'ultimo passo in quel caldo odore di Frosty con il barile che si riempiva vicino alla porta, perché avevo fatto troppi nomi in fretta prima, e ne avevo pagato il prezzo in paesi che non potevo lasciare. Ma il campo si era ristretto sotto di me mentre me ne stavo lì. Non un ragazzo con una lattina. Non un macellaio che ti urla in faccia. Non un padre che conta la sua ultima catasta di legna. Qualcuno con un mestiere tra le mani e un fornitore nei suoi registri, e un motivo per volere che il più antico panificio del viale rimanesse al buio prima di Natale.</w:t>
+        <w:t>«Lo è.» Non mi permisi di fare l'ultimo passo in quel caldo odore di Frosty's con il barile che si riempiva vicino alla porta, perché avevo fatto troppi nomi in fretta prima, e ne avevo pagato il prezzo in paesi che non potevo lasciare. Ma il campo si era ristretto sotto di me mentre me ne stavo lì. Non un ragazzo con una lattina. Non un macellaio che ti urla in faccia. Non un padre che conta la sua ultima catasta di legna. Qualcuno con un mestiere tra le mani e un fornitore nei suoi registri, e un motivo per volere che la più antica panetteria del viale rimanesse al buio prima di Natale.</w:t>
       </w:r>
     </w:p>
     <w:p/>
@@ -2953,7 +2953,7 @@
     </w:p>
     <w:p>
       <w:r>
-        <w:t>Perché tutto combaciava. Non un magazzino umido. Non la sfortuna. Una polvere comprata con un nome commerciale, mescolata alla sua farina da una mano che conosceva la dose al milligrammo, nascosta nel sacco e che si rivelava solo sulla lingua, dopo la cottura. Rimasi lì sul gradino di Doc e misi in fila i vecchi fatti, come avevo fatto da Frosty, solo più vicini ora, e più duri.</w:t>
+        <w:t>Perché tutto combaciava. Non un magazzino umido. Non la sfortuna. Una polvere comprata con un nome commerciale, mescolata alla sua farina da una mano che conosceva la dose al milligrammo, nascosta nel sacco e che si rivelava solo sulla lingua, dopo la cottura. Rimasi lì sul gradino di Doc e misi in fila i vecchi fatti, come avevo fatto da Frosty's, solo più vicini ora, e più duri.</w:t>
       </w:r>
     </w:p>
     <w:p>
@@ -2978,7 +2978,7 @@
     </w:p>
     <w:p>
       <w:r>
-        <w:t>Scendendo verso il prato nella luce blu calante, con l'intenzione di tornarmene dritta a casa, il pupazzo di neve vicino alla farmacia si era mosso di nuovo. Il grande assembramento sul prato era ancora inclinato verso il loro caldo e invisibile fuoco, paziente come sempre. Ma quello che era rimasto da solo all'imbocco del vicolo in quei due giorni si era spostato nel buio dell'ultimo giorno, e invece di essere inclinato verso il prato con gli altri, si spingeva con forza dall'altra parte, la sua faccia di carbone e tutto il suo peso informe inclinati verso il retro dei negozi di Evergreen.</w:t>
+        <w:t>Mentre scendevo verso il prato nella luce blu calante, con l'intenzione di tornarmene dritta a casa, vidi che il pupazzo di neve vicino alla farmacia si era mosso di nuovo. Il grande assembramento sul prato era ancora inclinato verso il loro caldo e invisibile fuoco, paziente come sempre. Ma quello che era rimasto da solo all'imbocco del vicolo in quei due giorni si era spostato nel buio dell'ultimo giorno, e invece di essere inclinato verso il prato con gli altri, si spingeva con forza dall'altra parte, la sua faccia di carbone e tutto il suo peso informe inclinati verso il retro dei negozi di Evergreen.</w:t>
       </w:r>
     </w:p>
     <w:p>
@@ -3031,7 +3031,7 @@
     <w:p/>
     <w:p>
       <w:r>
-        <w:t>La farina di Greta non arrivava dalla porta principale insieme ai clienti. Nessun fornaio faceva così. Arrivava a sacchi, calata da un carretto, giù per il vicolo in comune dietro i negozi di Evergreen. Il cortile di carico di cui Pete si era lamentato davanti al mio arrosto, uno spazio giusto per un furgone e abbastanza rancore per due. L'addetto alle consegne accostava il furgone alla banchina nelle ore buie e scaricava i sacchi oltre la porta sul retro, dove la luce era scarsa e il freddo li conservava. Lei li spostava nei bidoni lungo la parete di fondo man mano che le servivano nel corso della mattinata. La farina restava lì in mezzo, tra il carretto e il bidone, nell'unica stanza della Holly Jolly che nessun cliente vedeva mai e che nessun lampione raggiungeva, finché non la sollevava.</w:t>
+        <w:t>La farina di Greta non arrivava dalla porta principale insieme ai clienti. Nessun fornaio faceva così. Arrivava a sacchi, calata da un carretto, giù per il vicolo in comune dietro i negozi di Evergreen. Il cortile di carico di cui Pete si era lamentato davanti al mio arrosto, uno spazio giusto per un camion e abbastanza rancore per due. L'addetto alle consegne accostava il furgone alla banchina nelle ore buie e scaricava i sacchi oltre la porta sul retro, dove la luce era scarsa e il freddo li conservava. Lei li spostava nei bidoni lungo la parete di fondo man mano che le servivano nel corso della mattinata. La farina restava lì in mezzo, tra il carretto e il bidone, nell'unica stanza della Holly Jolly che nessun cliente vedeva mai e che nessun lampione raggiungeva, finché non la sollevava.</w:t>
       </w:r>
     </w:p>
     <w:p/>
@@ -3073,7 +3073,7 @@
     <w:p/>
     <w:p>
       <w:r>
-        <w:t>Il vicolo dietro i negozi di Evergreen percorreva l'intero isolato, un corridoio sgombrato dalla neve tra il retro dei negozi e il muro basso dei lotti sul fondo. Largo appena per un furgone e nulla più. Lo percorsi lentamente nella luce opaca del mattino, con Pip che mi camminava dietro silenziosa e guardinga, e osservai i retrobottega come non mi ero mai presa la briga di fare. Non più come muri, ma come porte. Ecco la porta d'acciaio della farmacia, tenuta chiusa, con il suo campanello. E qui le due che condividevano la banchina. Il magazzino frigorifero di Pete, un vecchio locale in blocchi di cemento con un pesante catenaccio, e il secondo lucchetto, nuovo e lucido, che aveva comprato da Tom per sbarrare il cancello. E tre porte più avanti quella di Greta, bassa e di legno, scolorita intorno alla maniglia da quarant'anni di mani intrise di farina.</w:t>
+        <w:t>Il vicolo dietro i negozi di Evergreen percorreva l'intero isolato, un corridoio sgombrato dalla neve tra il retro dei negozi e il muro basso dei lotti sul fondo. Largo appena per un furgone e nulla più. Lo percorsi lentamente nella luce opaca del mattino, con Pip che mi camminava dietro silenziosa e guardinga, e osservai i retrobottega come non mi ero mai presa la briga di fare. Non più come muri, ma come porte. Ecco la porta d'acciaio della farmacia, tenuta chiusa, con il suo campanello. E qui le due che condividevano la banchina. Il magazzino frigorifero di Pete, un vecchio locale in blocchi di cemento con una pesante chiusura, e il secondo lucchetto, nuovo e lucido, che aveva comprato da Tom per sbarrare il cancello. E tre porte più avanti quella di Greta, bassa e di legno, scolorita intorno alla maniglia da quarant'anni di mani intrise di farina.</w:t>
       </w:r>
     </w:p>
     <w:p/>
@@ -3276,7 +3276,7 @@
     </w:p>
     <w:p>
       <w:r>
-        <w:t>«Non è stato lui» dissi, e questa volta tralasciai il «Non credo.» Mi ero guadagnata una frase più breve.</w:t>
+        <w:t>«Non è stato lui» dissi, e questa volta tralasciai il "non credo". Mi ero guadagnata una frase più breve.</w:t>
       </w:r>
     </w:p>
     <w:p>
@@ -3407,12 +3407,12 @@
     </w:p>
     <w:p>
       <w:r>
-        <w:t>Si trovava dietro il bancone nel negozio chiuso, con il cartello CHIUSO ancora sulla porta e il vetro di nuovo intatto, il suo nome tornato a brillare in oro. Pip si diresse dritta verso il nuovo riquadro e si fermò a guardare fuori verso il viale, come per controllare che la vista fosse stata rimessa a posto. Greta si immobilizzò quando pronunciai il suo nome.</w:t>
-      </w:r>
-    </w:p>
-    <w:p>
-      <w:r>
-        <w:t>«Danny.» Si asciugò le mani sul grembiule. «Dicono che sia stato Danny. L'ho sentito ieri e non ho dormito da allora.» Fece il giro del bancone. «Jessica, ho lasciato andare quel ragazzo per la ragione più semplice di questo mondo, e non c'era nulla di colpevole da parte sua. Gli affari sono andati a rilento questo autunno, e non potevo permettermi di mantenere un lavoratore per il fine settimana a stipendio pieno con la stagione che tirava così. Lo feci sedere e glielo dissi chiaro e tondo, e gli diedi due settimane di paga che non aveva lavorato e una scatola di dolci del giorno prima per sua madre; lui prese tutto in silenzio, vergognandosi delle lacrime agli occhi, e filò via prima che potessi dire metà di quello che avrei voluto.» La voce le si incrinò. «Un buon lavoratore. Lento a sciogliersi ma costante una volta preso il via. E adesso lo accusano di aver scritto SPORCA sul mio muro, e non riesco a far coincidere questa immagine con il ragazzo che un tempo metteva in fila le mie scatole del mattino con precisione perché non sopportava vederle storte.»</w:t>
+        <w:t>Si trovava dietro il bancone nel negozio chiuso, con il cartello CHIUSO ancora sulla porta e il vetro di nuovo intatto, il suo nome tornato a brillare in oro. Pip si diresse dritta verso il nuovo riquadro e si fermò a guardare fuori verso il viale, come per controllare che la vista fosse stata rimessa a posto. Greta si immobilizzò quando pronunciai il nome del ragazzo.</w:t>
+      </w:r>
+    </w:p>
+    <w:p>
+      <w:r>
+        <w:t>«Danny.» Si asciugò le mani sul grembiule. «Dicono che sia stato Danny. L'ho sentito ieri e non ho dormito da allora.» Fece il giro del bancone. «Jessica, ho lasciato andare quel ragazzo per la ragione più semplice di questo mondo, e non c'era nulla di colpevole da parte sua. Gli affari sono andati a rilento questo autunno, e non potevo permettermi di mantenere un lavoratore per il fine settimana a stipendio pieno con la stagione che tirava così. L'ho fatto sedere e gliel'ho detto chiaro e tondo, e gli ho dato due settimane di paga che non aveva lavorato e una scatola di dolci del giorno prima per sua madre; lui ha preso tutto in silenzio, vergognandosi delle lacrime agli occhi, ed è filato via prima che potessi dire metà di quello che avrei voluto.» La voce le si incrinò. «Un buon lavoratore. Lento a sciogliersi ma costante una volta preso il via. E adesso lo accusano di aver scritto SPORCA sul mio muro, e non riesco a far coincidere questa immagine con il ragazzo che un tempo metteva in fila le mie scatole del mattino con precisione perché non sopportava vederle storte.»</w:t>
       </w:r>
     </w:p>
     <w:p>
@@ -3422,7 +3422,7 @@
     </w:p>
     <w:p>
       <w:r>
-        <w:t>«Ferito, non arrabbiato.» Si tormentava il grembiule. «Un ragazzo arrabbiato ti sbatte la porta in faccia. Danny mi strinse la mano. Andava fiero di quella paga.» Mi guardò, sconvolta. «Ma è proprio questo che diranno, vero? Che la ferita si è trasformata in rancore. Che io gli voglio bene, quindi sarei l'ultima a vederlo.»</w:t>
+        <w:t>«Ferito, non arrabbiato.» Si tormentava il grembiule. «Un ragazzo arrabbiato ti sbatte la porta in faccia. Danny mi ha stretto la mano. Andava fiero di quella paga.» Mi guardò, sconvolta. «Ma è proprio questo che diranno, vero? Che la ferita si è trasformata in rancore. Che io gli voglio bene, quindi sarei l'ultima a vederlo.»</w:t>
       </w:r>
     </w:p>
     <w:p>
@@ -3452,7 +3452,7 @@
     </w:p>
     <w:p>
       <w:r>
-        <w:t>Dopo un momento lui prese l'altra, gobbo, con il respiro che si alzava grigio nell'aria. Pip lo esaminò con la testa inclinata di lato. Poi infilò il becco nella neve accanto alla gamba della panchina, tirò fuori una rondella d'acciaio lucida che qualcuno aveva perso e la posò sulla punta del suo stivale. Lui la guardò fisso per un lungo momento, senza darle un calcio per allontanarla.</w:t>
+        <w:t>Dopo un momento lui prese l'altra, ingobbito, con il respiro che si alzava grigio nell'aria. Pip lo esaminò con la testa inclinata di lato. Poi infilò il becco nella neve accanto alla gamba della panchina, tirò fuori una rondella d'acciaio lucida che qualcuno aveva perso e la posò sulla punta del suo stivale. Lui la guardò fisso per un lungo momento, senza darle un calcio per allontanarla.</w:t>
       </w:r>
     </w:p>
     <w:p>
@@ -3782,7 +3782,7 @@
     </w:p>
     <w:p>
       <w:r>
-        <w:t>La vecchia scatola rimase dov'era, sigillata sotto il suo cartoncino nella saletta anteriore della Società fino alla sua ora. Ognuno aveva tracciato una linea netta nella propria mente tra le due, senza che un'anima avesse bisogno di dirlo ad alta voce. La vecchia doveva essere aperta a capodanno, in compagnia, come intendevano gli antenati. La nuova doveva essere riempita ora, da mani vive, e sepolta chiusa per un altro secolo. Una su cui si attende. Una a cui si aggiunge. Guardando i miei vicini deporre i loro piccoli tesori nella nuova capsula mentre i barili di scatolette e pane scorrevano per le case sulla collina, pensai di non aver mai visto Frost Falls così totalmente se stessa.</w:t>
+        <w:t>La vecchia scatola rimase dov'era, sigillata sotto il suo cartoncino nella saletta anteriore della Società fino alla sua ora. Ognuno aveva tracciato una linea netta nella propria mente tra le due, senza che un'anima avesse bisogno di dirlo ad alta voce. La vecchia doveva essere aperta a capodanno, in compagnia, come intendevano gli antenati. La nuova doveva essere riempita ora, da mani vive, e sepolta chiusa per un altro secolo. Una da aspettare. Una a cui aggiungere. Guardando i miei vicini deporre i loro piccoli tesori nella nuova capsula mentre i barili di scatolette e pane scorrevano per le case sulla collina, pensai di non aver mai visto Frost Falls così totalmente se stessa.</w:t>
       </w:r>
     </w:p>
     <w:p>
@@ -3865,7 +3865,7 @@
     </w:p>
     <w:p>
       <w:r>
-        <w:t>Non si poteva fissare l'inaugurazione in base a una chiusura che non era ancora avvenuta. Non per fortuna. A meno che tu non sapessi che stava arrivando, perché eri tu quella che la provocava.</w:t>
+        <w:t>Non si poteva fissare l'inaugurazione in base a una chiusura che non era ancora avvenuta. Non per fortuna. A meno che tu non sapessi che stava arrivando, perché eri tu a provocarla.</w:t>
       </w:r>
     </w:p>
     <w:p/>
@@ -3892,7 +3892,7 @@
     </w:p>
     <w:p>
       <w:r>
-        <w:t>Mi avvicinai. Non per accusare. Tutto in me voleva attraversare quella sala, sollevare il volantino e chiederle di spiegare quella settimana faccia a faccia. Non lo feci. Un sospetto sventolato in una sala calda sarebbe stato solo una crudeltà, e avevo passato queste settimane a imparare il costo delle cose sfacciate e facili. Mi avvicinai per ascoltare.</w:t>
+        <w:t>Mi avvicinai. Non per accusare. Tutto in me voleva attraversare quella sala, sollevare il volantino e chiederle di spiegare quella settimana davanti a tutte loro. Non lo feci. Un sospetto sventolato in una sala calda sarebbe stato solo una crudeltà, e avevo passato queste settimane a imparare il costo delle cose sfacciate e facili. Mi avvicinai per ascoltare.</w:t>
       </w:r>
     </w:p>
     <w:p>
@@ -3912,7 +3912,7 @@
     </w:p>
     <w:p>
       <w:r>
-        <w:t>«Il volume è sempre e solo questione di un impasto che si comporta bene» disse, disinvolta, alla piccola folla. «Una teglia di croissant puoi coccolartela. Ma con i numeri delle feste vuoi una farina che reagisca allo stesso modo ogni singolo giorno, in una cucina calda o fredda, o l'intera produzione va in malora entro il ventesimo giorno. Quindi la si tratta. Un sussurro di enzima, un poco di acido ascorbico, che non è altro che vitamina C. Nulla che si possa assaggiare, giusto quanto basta per rendere l'impasto docile e mantenere la brioche morbida un giorno in più. Il mio fornitore di Portland miscela la mia secondo le mie specifiche.» Sorrise tutt'intorno a loro. «I vecchi fornai di paese non la toccherebbero, naturalmente. Preferiscono dare la colpa all'umidità.»</w:t>
+        <w:t>«Il volume è sempre e solo questione di un impasto che si comporta bene» disse, disinvolta, alla piccola folla. «Una teglia di croissant puoi coccolartela. Ma con i numeri delle feste vuoi una farina che reagisca allo stesso modo ogni singolo giorno, in una cucina calda o fredda, o l'intera produzione va in malora entro il venti. Quindi la si tratta. Un sussurro di enzima, un poco di acido ascorbico, che non è altro che vitamina C. Nulla che si possa assaggiare, giusto quanto basta per rendere l'impasto docile e mantenere la brioche morbida un giorno in più. Il mio fornitore di Portland miscela la mia secondo le mie specifiche.» Sorrise tutt'intorno a loro. «I vecchi fornai di paese non la toccherebbero, naturalmente. Preferiscono dare la colpa all'umidità.»</w:t>
       </w:r>
     </w:p>
     <w:p>
@@ -3928,10 +3928,10 @@
         <w:rPr>
           <w:i/>
         </w:rPr>
-        <w:t>Acido secco. Qualcuno ce l'ha messo. E sapeva esattamente quanto metterne.</w:t>
-      </w:r>
-      <w:r>
-        <w:t xml:space="preserve"> Un acido, aveva detto, con la naturalezza del tempo atmosferico, a una cerchia di donne vicino a un barile di provviste. Una polvere mescolata alla sua farina su sua ordinazione da un fornitore che ci avrebbe messo qualunque cosa lei avesse chiesto. Una donna che sapeva al milligrammo quanto un impasto avrebbe retto, e sapeva dunque quanto ce ne sarebbe voluto per rovinarlo.</w:t>
+        <w:t>Acido secco. Qualcuno ce l'ha messa. E sapeva esattamente quanta metterne.</w:t>
+      </w:r>
+      <w:r>
+        <w:t xml:space="preserve"> Un acido, aveva detto, con la disinvoltura di chi parla del tempo, a una cerchia di donne vicino a un barile di provviste. Una polvere mescolata alla sua farina su sua ordinazione da un fornitore che ci avrebbe messo qualunque cosa lei avesse chiesto. Una donna che sapeva al milligrammo quanto un impasto avrebbe retto, e sapeva dunque quanto ce ne sarebbe voluto per rovinarlo.</w:t>
       </w:r>
     </w:p>
     <w:p>
@@ -3977,7 +3977,7 @@
     </w:p>
     <w:p>
       <w:r>
-        <w:t>Ero stata lenta. Non lenta a lavorare la farina, o il vicolo. Avevo letto tutto questo in modo corretto. Lenta su un'unica cosa. Per tutta la settimana l'avevo presa in considerazione nella mia mente per poi rimetterla da parte, mentre andavo a caccia di danni in un ragazzo ferito, in un macellaio risentito, in una famiglia che contava la legna da ardere. Perché era nuova, e amabile, e mi aveva sfamata.</w:t>
+        <w:t>Ero stata lenta. Non lenta a venire a capo della farina, o del vicolo. Avevo letto tutto questo in modo corretto. Lenta su un'unica cosa. Per tutta la settimana l'avevo presa in considerazione nella mia mente per poi rimetterla da parte, mentre andavo a caccia di danni in un ragazzo ferito, in un macellaio risentito, in una famiglia che contava la legna da ardere. Perché era nuova, e amabile, e mi aveva sfamata.</w:t>
       </w:r>
     </w:p>
     <w:p>
@@ -4058,7 +4058,7 @@
     </w:p>
     <w:p>
       <w:r>
-        <w:t>«Non avrà visto un dicembre su questa strada come quello che sta arrivando» disse con disinvoltura, posando la tazza davanti a me. «Ho fatto i conti. La popolazione, le cene in chiesa, la scuola, l'intero calendario delle feste che tenete. C'è più voglia di dolci in questo paese a Natale di quanta ne abbia mai avuto un posto dove spenderla, perché ha sempre avuto solo la vecchia panetteria dove spenderlo. Con i prezzi di campagna. Con i prodotti di campagna.» Disse "la vecchia panetteria" con tono amabile, nominando qualcosa che apparteneva già al passato. «Tutto quel giro cerca un posto dove andare. Ed eccomi qui.»</w:t>
+        <w:t>«Non avrà visto un dicembre su questa strada come quello che sta arrivando» disse con disinvoltura, posando la tazza davanti a me. «Ho fatto i conti. La popolazione, le cene in chiesa, la scuola, l'intero calendario delle feste che tenete. In questo paese, a Natale, c'è più denaro da spendere in dolci di quanti posti ci siano mai stati per spenderlo, perché c'è sempre stata soltanto la vecchia panetteria. Con i prezzi di campagna. Con i prodotti di campagna.» Disse "la vecchia panetteria" con tono amabile, nominando qualcosa che apparteneva già al passato. «Tutto quel giro cerca un posto dove andare. Ed eccomi qui.»</w:t>
       </w:r>
     </w:p>
     <w:p>
@@ -4068,7 +4068,7 @@
     </w:p>
     <w:p>
       <w:r>
-        <w:t>«Oh, Greta.» Un piccolo suono, metà risata. Simpatia in superficie e qualcosa di più freddo sotto, e quel freddo era la parte più vera. «Poveretta. Che tempismo miserabile, i suoi guai sono arrivati nel mese in cui se li può permettere meno.» Si appoggiò con un fianco al marmo, facendosi confidenziale. «Tra noi, non sono sorpresa. Quell'edificio ha cento anni se ne ha uno, e non si può gestire una cucina commerciale in un posto simile pretendendo che la contea chiuda un occhio per sempre. La stuccatura cede. Le guarnizioni cedono. Il lavandino di servizio è collegato a un vecchio tubo e ti ritrovi a due gradi sotto la soglia consentita senza saperlo finché non entra un uomo con un termometro. Non è colpa sua, esattamente. Ma non è nemmeno sfortuna. È una vecchia cucina che presenta il conto, nell'ora peggiore.»</w:t>
+        <w:t>«Oh, Greta.» Un piccolo suono, metà risata. Simpatia in superficie e qualcosa di più freddo sotto, e quel freddo era la parte più vera. «Poveretta. Che tempismo miserabile, i suoi guai sono arrivati nel mese in cui se li può permettere meno.» Si appoggiò con un fianco al marmo, facendosi confidenziale. «Tra noi, non sono sorpresa. Quell'edificio ha cento anni se ne ha uno, e non si può gestire una cucina commerciale in un posto simile pretendendo che la contea chiuda un occhio per sempre. La stuccatura cede. La guarnizione cede. Il lavandino di servizio è collegato a un vecchio tubo e ti ritrovi a due gradi sotto la soglia consentita senza saperlo finché non entra un uomo con un termometro. Non è colpa sua, esattamente. Ma non è nemmeno sfortuna. È una vecchia cucina che presenta il conto, nell'ora peggiore.»</w:t>
       </w:r>
     </w:p>
     <w:p>
@@ -4536,7 +4536,7 @@
     <w:p/>
     <w:p>
       <w:r>
-        <w:t>«Questo me lo tengo dentro, Jessica» disse. «Tutto quanto.»</w:t>
+        <w:t>«Questo resta tra noi, Jessica» disse. «Tutto quanto.»</w:t>
       </w:r>
     </w:p>
     <w:p/>
@@ -4627,12 +4627,12 @@
     </w:p>
     <w:p>
       <w:r>
-        <w:t>Si era spaccata nel cuore della notte. Una lunga fessura lungo il suo vecchio fianco di ferro dove l'acqua gelava più in fretta di quanto il fuoco potesse reggere, e questa volta si era fermata per sempre. Nessun sussulto, nessun tepore leggero spinto su per le scale. Il tetto reggeva a fatica già da anni, e con lo stesso freddo si era aperta una giuntura sopra la stanza dell'archivio. Ciò che era filtrato non era pioggia ma lo scioglimento del giorno prima, trasformatosi in una lenta perdita dal soffitto una volta spento il fuoco e penetrato il freddo, e aveva raggiunto gli scaffali bassi prima che chiunque sapesse che il fuoco era spento.</w:t>
-      </w:r>
-    </w:p>
-    <w:p>
-      <w:r>
-        <w:t>Ci andai. Certo che ci andai. Pip mi venne dietro sulle orme scricchiolanti e per una volta non si fermò a nessun davanzale. Si spinse attraverso il vestibolo davanti a me in un freddo che dentro era peggio che fuori. Il freddo immobile di un edificio la cui caldaia aveva smesso di funzionare.</w:t>
+        <w:t>Si era spaccata nel cuore della notte. Una lunga fessura lungo il suo vecchio fianco di ferro dove l'acqua gelava più in fretta di quanto il fuoco potesse reggere, e questa volta si era fermata per sempre. Nessuna ripartenza, nessun tepore leggero spinto su per le scale. Il tetto reggeva a fatica già da anni, e con lo stesso freddo si era aperta una giuntura sopra la stanza dell'archivio. Ciò che era filtrato non era pioggia ma lo scioglimento del giorno prima, trasformatosi in una lenta perdita dal soffitto una volta spento il fuoco e penetrato il freddo, e aveva raggiunto gli scaffali bassi prima che chiunque sapesse che il fuoco era spento.</w:t>
+      </w:r>
+    </w:p>
+    <w:p>
+      <w:r>
+        <w:t>Ci andai. Certo che ci andai. Pip mi venne dietro sulla neve scricchiolante e per una volta non si fermò a nessun davanzale. Si spinse attraverso il vestibolo davanti a me in un freddo che dentro era peggio che fuori. Il freddo immobile di un edificio la cui caldaia aveva smesso di funzionare.</w:t>
       </w:r>
     </w:p>
     <w:p>
@@ -4642,7 +4642,7 @@
     </w:p>
     <w:p>
       <w:r>
-        <w:t>«Ferris aveva intenzione di metterci la caldaia» disse Hal, a bassa voce, tra sé e sé o rivolto a me. «L'intero costo, se il comune avesse fatto il tetto. Questa era la proposta. Ma adesso il tetto è andato anche lui, e il tetto costa la metà in più, e Ferris ci mette i soldi per una caldaia in una buona stagione, ma fa i conti in tasca in una cattiva.» Si strofinò il viso. «Non dirà di no apertamente. Dirà di aspettare la primavera. Di vedere. Per la primavera il gelo sarà penetrato in tutto il soffitto. È la collezione ormai, Jessica. L'edificio e tutto ciò che c'è dentro.»</w:t>
+        <w:t>«Ferris aveva intenzione di metterci la caldaia» disse Hal, a bassa voce, tra sé e sé o rivolto a me. «L'intero costo, se il paese avesse fatto il tetto. Questa era la proposta. Ma adesso il tetto è andato anche lui, e il tetto costa la metà in più, e Ferris ci mette i soldi per una caldaia in una buona stagione, ma fa i conti in tasca in una cattiva.» Si strofinò il viso. «Non dirà di no apertamente. Dirà di aspettare la primavera. Di vedere. Per la primavera il gelo sarà penetrato in tutto il soffitto. È la collezione ormai, Jessica. L'edificio e tutto ciò che c'è dentro.»</w:t>
       </w:r>
     </w:p>
     <w:p>
@@ -4872,12 +4872,12 @@
     </w:p>
     <w:p>
       <w:r>
-        <w:t>«Ricordo che me lo dicesti. Non ci avevi dato molta importanza.»</w:t>
-      </w:r>
-    </w:p>
-    <w:p>
-      <w:r>
-        <w:t>«Non ci avevo dato alcuna importanza. Un autista fermo per un sonnellino. Ma Pete conosce ogni camion che entra in quel cortile, e ha detto che non era quello del fornitore di carne, e io ci ho sentito 'di nessuno'.» Spostai il dito lungo il cucchiaio fino alla pepiera. «E la figura di Danny. Sottile e svelta, alla soglia di Greta prima che i suoi forni si accendessero, e risalita verso l'estremità lontana. Io ci ho sentito il negozio dorato. Non ha mai detto che fosse entrato da Sugarplum. Ha detto all'estremità lontana. Il negozio ce l'ho messo io.»</w:t>
+        <w:t>«Ricordo che me l'hai detto. Non ci avevi dato molta importanza.»</w:t>
+      </w:r>
+    </w:p>
+    <w:p>
+      <w:r>
+        <w:t>«Non ci avevo dato alcuna importanza. Un autista fermo per un sonnellino. Ma Pete conosce ogni camion che entra in quel cortile, e ha detto che non era quello del fornitore di carne, e io ci ho sentito "di nessuno".» Spostai il dito lungo il cucchiaio fino alla pepiera. «E la figura di Danny. Sottile e svelta, alla soglia di Greta prima che i suoi forni si accendessero, e risalita verso l'estremità lontana. Io ci ho sentito il negozio dorato. Non ha mai detto che fosse entrata da Sugarplum. Ha detto all'estremità lontana. Il negozio ce l'ho messo io.»</w:t>
       </w:r>
     </w:p>
     <w:p>
@@ -4910,7 +4910,7 @@
     </w:p>
     <w:p>
       <w:r>
-        <w:t>«La mattina in cui camminavano tutti, gli altri sono andati sul prato e si sono appoggiati lungo la stradina verso il tuo focolare. Quello è andato dall'altra parte, a tre metri dalla loro compagnia, oltre la farmacia, fino in fondo al vicolo. Mi sono fermata davanti a lui e gli ho chiesto che cosa stesse guardando.» Toccai la crosta dove se ne stava isolata. «Mi ero messa in testa che stesse guardando qualcosa. Non ho mai chiesto dove fosse piantato. Sull'unica chiazza a quell'estremità in cui un furgone avrebbe potuto accostare dal viale senza che nessuno dall'estremità di Greta potesse vederlo.»</w:t>
+        <w:t>«La mattina in cui camminavano tutti, gli altri sono andati sul prato e si sono inclinati verso la stradina e il tuo focolare. Quello è andato dall'altra parte, a tre metri dalla loro compagnia, oltre la farmacia, fino in fondo al vicolo. Mi sono fermata davanti a lui e gli ho chiesto che cosa stesse guardando.» Toccai la crosta dove se ne stava isolata. «Mi ero messa in testa che stesse guardando qualcosa. Non ho mai chiesto dove fosse piantato. Sull'unica chiazza a quell'estremità in cui un furgone avrebbe potuto accostare dal viale senza che nessuno dall'estremità di Greta potesse vederlo.»</w:t>
       </w:r>
     </w:p>
     <w:p>
@@ -4925,7 +4925,7 @@
     </w:p>
     <w:p>
       <w:r>
-        <w:t>Pip era uscita da sotto il tavolo. Si era alzata sulle punte all'orlo del tavolo, aveva esaminato la crosta all'estremità del cucchiaio e aveva deciso che non faceva per lei.</w:t>
+        <w:t>Pip era uscita da sotto il tavolo. Si alzò sulle punte all'orlo del tavolo, esaminò la crosta all'estremità del cucchiaio e decise che non faceva per lei.</w:t>
       </w:r>
     </w:p>
     <w:p>
@@ -5166,7 +5166,7 @@
     </w:p>
     <w:p>
       <w:r>
-        <w:t>«Una panetteria di Bridgton.»</w:t>
+        <w:t>«Un panificio di Bridgton.»</w:t>
       </w:r>
     </w:p>
     <w:p>
@@ -5176,7 +5176,7 @@
     </w:p>
     <w:p>
       <w:r>
-        <w:t>«Quando l'addetto della contea stava uscendo dalla mia porta» disse Greta, «disse "la camera fredda".»</w:t>
+        <w:t>«Quando l'addetto della contea stava uscendo dalla mia porta» disse Greta, «ha detto "la camera fredda".»</w:t>
       </w:r>
     </w:p>
     <w:p>
@@ -5241,7 +5241,7 @@
     </w:p>
     <w:p>
       <w:r>
-        <w:t>«Che eravamo troppo vecchie per andare avanti.» Si fermò e deglutì prima di poter continuare. «Lunedì mi ha portato un pasticcio di tonno. Quello di sua madre. Con i piselli dentro e le patatine in busta sbriciolate sopra. Non lo assaggiavo da quando se n'era andata. Sono rimasta proprio qui dopo che se ne fu andata, ne ho mangiato metà direttamente dalla pirofila e ho pianto dentro come un'idiota, e ieri sera l'ho lavata e messa vicino alla porta per riportargliela.» Non guardò la pirofila. «Avevo intenzione di portargliela a Bridgton in macchina io stessa. Stavo per bussare alla sua porta.»</w:t>
+        <w:t>«Che eravamo troppo vecchie per andare avanti.» Si fermò e deglutì prima di poter continuare. «Lunedì mi ha portato un pasticcio di tonno. Quello di sua madre. Con i piselli dentro e le patatine in busta sbriciolate sopra. Non lo assaggiavo da quando se n'era andata. Sono rimasta proprio qui dopo che se n'era andata, ne ho mangiato metà direttamente dalla pirofila e ho pianto dentro come un'idiota, e ieri sera l'ho lavata e messa vicino alla porta per riportargliela.» Non guardò la pirofila. «Avevo intenzione di portargliela a Bridgton in macchina io stessa. Stavo per bussare alla sua porta.»</w:t>
       </w:r>
     </w:p>
     <w:p>
@@ -5251,7 +5251,7 @@
     </w:p>
     <w:p>
       <w:r>
-        <w:t xml:space="preserve">«Avevo ventitré anni» disse Greta. «Joyce non era molto più grande. Eravamo noi due, con le ricette di mia madre e un prestito dello zio di Joyce e questo edificio con il tetto che perdeva sopra la cella di lievitazione. Lei faceva il pane e io i dolci. È sempre stata più brava di me a fare il pane. Non gliel'ho mai detto. Avrei dovuto dirglielo.» Girò una pagina del registro degli ordini e la riportò indietro. «Quindici anni. Ero al suo matrimonio. Ha preso in braccio il mio primo bambino prima di Harold, perché Harold era fuori nel parcheggio a sentirsi male. Tutti quegli anni in questa cucina, alle quattro del mattino ogni singolo giorno, e poi i soldi e gli avvocati, e il nome sopra la porta, e…» Si fermò. «E la torta. Tutti in due contee hanno sentito parlare della torta. Non ho intenzione di parlare della torta.»</w:t>
+        <w:t xml:space="preserve">«Avevo ventitré anni» disse Greta. «Joyce non era molto più grande. Eravamo noi due, con le ricette di mia madre e un prestito dello zio di Joyce e questo edificio con il tetto che perdeva sopra la cella di lievitazione. Lei faceva il pane e io i dolci. È sempre stata più brava di me a fare il pane. Non gliel'ho mai detto. Avrei dovuto dirglielo.» Girò una pagina del registro degli ordini e la riportò indietro. «Quindici anni. Le ho fatto da testimone al matrimonio. Ha preso in braccio il mio primo bambino prima di Harold, perché Harold era fuori nel parcheggio a sentirsi male. Tutti quegli anni in questa cucina, alle quattro del mattino ogni singolo giorno, e poi i soldi e gli avvocati, e il nome sopra la porta, e…» Si fermò. «E la torta. Tutti in due contee hanno sentito parlare della torta. Non ho intenzione di parlare della torta.»</w:t>
       </w:r>
     </w:p>
     <w:p>
@@ -5332,7 +5332,7 @@
     </w:p>
     <w:p>
       <w:r>
-        <w:t>«È finita nella spazzatura, Jessica.» La voce di Greta era piatta e stanca, e poi, dopo un attimo: «Stillwater. Stillwater qualcosa. Me lo ricordo perché sembrava un'impresa di pompe funebri, e glielo dissi pure al bidone della spazzatura.»</w:t>
+        <w:t>«È finita nella spazzatura, Jessica.» La voce di Greta era piatta e stanca, e poi, dopo un attimo: «Stillwater. Stillwater qualcosa. Me lo ricordo perché sembrava un'impresa di pompe funebri, e gliel'ho pure detto, al bidone della spazzatura.»</w:t>
       </w:r>
     </w:p>
     <w:p>
@@ -5342,7 +5342,7 @@
     </w:p>
     <w:p>
       <w:r>
-        <w:t>«Da Pelkey, a Lewiston. Ogni fornaio all'ingrosso di questo lato delle montagne si serve da Pelkey.» Trasse un respiro. «Joyce aprì il nostro conto lì di persona, il primo anno, e se l'è portato dietro quando se n'è andata, e non l'avrà cambiato. Joyce preferirebbe litigare con un fornitore piuttosto che mollarlo.» Un altro respiro. «Non passare oggi. E non farmi la gentile neanche al telefono. Non la reggo.»</w:t>
+        <w:t>«Da Pelkey's, a Lewiston. Ogni fornaio all'ingrosso di questo lato delle montagne si serve da Pelkey's.» Trasse un respiro. «Joyce ha aperto il nostro conto lì di persona, il primo anno, e se l'è portato dietro quando se n'è andata, e non l'avrà cambiato. Joyce preferirebbe litigare con un fornitore piuttosto che mollarlo.» Un altro respiro. «Non passare oggi. E non farmi la gentile neanche al telefono. Non la reggo.»</w:t>
       </w:r>
     </w:p>
     <w:p>
@@ -5450,7 +5450,7 @@
     </w:p>
     <w:p>
       <w:r>
-        <w:t>«D'accordo!» disse, e fece partire il furgone subito dopo. «Lei è la responsabile della stampa.»</w:t>
+        <w:t>«D'accordo!» disse, e subito dopo mandò in stampa anche la pagina del furgone. «Lei è la responsabile della stampa.»</w:t>
       </w:r>
     </w:p>
     <w:p>
@@ -5480,7 +5480,7 @@
     </w:p>
     <w:p>
       <w:r>
-        <w:t>«È quello» disse Pete. «Quel nastro. I miei fari girarono l'angolo, e si illuminò di rosso sul retro delle porte come se qualcuno ci avesse appeso delle luci. E il tetto è alto così. Più alto del necessario per un furgone, mi ricordo di aver pensato.» Picchiettò sulla targa. «Maine. Sapevo che non era dei nostri. Non presi il numero, e non andrò a dirlo a nessuno.»</w:t>
+        <w:t>«È quello» disse Pete. «Quel nastro. I miei fari hanno girato l'angolo, e si è illuminato di rosso sul retro delle porte come se qualcuno ci avesse appeso delle luci. E il tetto è alto così. Più alto del necessario per un furgone, mi ricordo di aver pensato.» Picchiettò sulla targa. «Maine. Sapevo che non era dei nostri. Non ho preso il numero, e non andrò a raccontare a nessuno di averlo preso.»</w:t>
       </w:r>
     </w:p>
     <w:p>
@@ -5525,7 +5525,7 @@
     </w:p>
     <w:p>
       <w:r>
-        <w:t xml:space="preserve">«Doc ha trovato una base acida nella farina di Greta» dissi. «Quella che i panifici comprano per la segale. Un forno di Bridgton ha telefonato ai clienti di Greta chiamandoli per nome, offrendosi di prendere in carico i loro ordini per la Holly Jolly. E la società che ha scritto ad agosto per comprare la quota di Greta è intestata alla donna che possiede quel forno.» Trassi un respiro prima dell'unica domanda per cui avevo chiamato. «Riesci a scoprire se Pelkey's di Lewiston ha consegnato una base acida al Wendt's Bakehouse questo autunno?»</w:t>
+        <w:t xml:space="preserve">«Doc ha trovato una base acida nella farina di Greta» dissi. «Quella che i panifici comprano per la segale. Un panificio di Bridgton ha telefonato ai clienti di Greta chiamandoli per nome, offrendosi di prendere in carico i loro ordini per la Holly Jolly. E la società che ha scritto ad agosto per comprare la quota di Greta è intestata alla donna che possiede quel panificio.» Trassi un respiro prima dell'unica domanda per cui avevo chiamato. «Riesci a scoprire se Pelkey's di Lewiston ha consegnato una base acida al Wendt's Bakehouse questo autunno?»</w:t>
       </w:r>
     </w:p>
     <w:p>
@@ -5565,7 +5565,7 @@
     </w:p>
     <w:p>
       <w:r>
-        <w:t>«Bob Pelkey stava cenando con i nipoti» disse Tanaka. «Ha controllato sul portatile al tavolo della cucina. Il Wendt's Bakehouse ha un conto da loro da venticinque anni. Un sacco della loro base acida ogni poche settimane, per la segale che cuoceva per le locande, fino a giugno. Poi più niente. Dice che ha perso il grosso contratto con la locanda durante l'estate, e con quello se n'è andata anche la segale.» Dalla sua parte si girò una pagina. «Poi un sacco il ventisette ottobre, consegnato al forno. Dice che la bolla del corriere è firmata J. Wendt. Domani mattina presto andrà in ufficio a mandarmi le fatture e le bolle firmate.»</w:t>
+        <w:t>«Bob Pelkey stava cenando con i nipoti» disse Tanaka. «Ha controllato sul portatile al tavolo della cucina. Il Wendt's Bakehouse ha un conto da loro da venticinque anni. Un sacco della loro base acida ogni poche settimane, per la segale che cuoceva per le locande, fino a giugno. Poi più niente. Dice che ha perso il grosso contratto con la locanda durante l'estate, e con quello se n'è andata anche la segale.» Dalla sua parte si girò una pagina. «Poi un sacco il ventisette ottobre, consegnato al panificio. Dice che la bolla del corriere è firmata J. Wendt. Domani mattina presto andrà in ufficio a mandarmi le fatture e le bolle firmate.»</w:t>
       </w:r>
     </w:p>
     <w:p>
@@ -5700,7 +5700,7 @@
     </w:p>
     <w:p>
       <w:r>
-        <w:t>Una pila sottile di fatture di Pelkey giaceva già sul suo sottomano. Aprì il suo taccuino logoro sopra di esse, appoggiò la penna di traverso sulla pagina e mi guardò mentre parlavo. Aveva fatto lo stesso il mese prima. Non scriveva mentre decideva se crederti o meno.</w:t>
+        <w:t>Una pila sottile di fatture di Pelkey's giaceva già sul suo sottomano. Aprì il suo taccuino logoro sopra di esse, appoggiò la penna di traverso sulla pagina e mi guardò mentre parlavo. Aveva fatto lo stesso il mese prima. Non scriveva mentre decideva se crederti o meno.</w:t>
       </w:r>
     </w:p>
     <w:p>
@@ -5710,7 +5710,7 @@
     </w:p>
     <w:p>
       <w:r>
-        <w:t>«Il registro degli ordini del Ringraziamento di Greta era aperto sul suo banco la mattina in cui la vetrina è andata in frantumi» dissi. «Joyce Wendt sedeva accanto a esso con i suoi occhiali da lettura e il telefono in mano. Venerdì sera Martha e Ivy hanno ricevuto entrambe una chiamata da una panetteria di Bridgton, che si offriva di evadere i loro ordini per la Holly Jolly. Fino alle torte.»</w:t>
+        <w:t>«Il registro degli ordini del Ringraziamento di Greta era aperto sul suo banco la mattina in cui la vetrina è andata in frantumi» dissi. «Joyce Wendt sedeva accanto a esso con i suoi occhiali da lettura e il telefono in mano. Venerdì sera Martha e Ivy hanno ricevuto entrambe una chiamata da un panificio di Bridgton, che si offriva di evadere i loro ordini per la Holly Jolly. Fino alle torte.»</w:t>
       </w:r>
     </w:p>
     <w:p>
@@ -5730,7 +5730,7 @@
     </w:p>
     <w:p>
       <w:r>
-        <w:t>«Danny Ott ha visto una figura magra e svelta alla soglia di Greta prima dell'alba, che si allontanava verso l'estremità lontana. Un'altra mattina ha visto un cartone con dell'oro sull'etichetta alla sua porta. Il foglio di Claire colloca Joyce dietro la lettera dell'avvocato che Greta ha stracciato ad agosto.» Toccai la carta piegata in grembo. «Il volantino di Renée per la settimana di apertura giaceva in bozza sul suo banco per tutto ottobre, mentre Joyce passava a trovarla con dei campioni, e l'esposto è arrivato proprio in quella settimana. Il volantino non è stato affisso alla bacheca della Grange fino al trenta. Il sacco di Pelkey è andato a Bridgton il ventisette. E il biglietto di Doc dice che la polvere nel mio barattolo corrisponde alla base acida, prova dopo prova.»</w:t>
+        <w:t>«Danny Ott ha visto una figura magra e svelta alla soglia di Greta prima dell'alba, che si allontanava verso l'estremità lontana. Un'altra mattina ha visto un cartone con dell'oro sull'etichetta alla sua porta. Il foglio di Claire colloca Joyce dietro la lettera dell'avvocato che Greta ha stracciato ad agosto.» Toccai la carta piegata in grembo. «Il volantino di Renée per la settimana di apertura giaceva in bozza sul suo banco per tutto ottobre, mentre Joyce passava a trovarla con dei campioni, e l'esposto è arrivato proprio in quella settimana. Il volantino non è stato affisso alla bacheca della Grange fino al trenta. Il sacco di Pelkey's è andato a Bridgton il ventisette. E il biglietto di Doc dice che la polvere nel mio barattolo corrisponde alla base acida, prova dopo prova.»</w:t>
       </w:r>
     </w:p>
     <w:p>
@@ -6070,7 +6070,7 @@
     <w:p/>
     <w:p>
       <w:r>
-        <w:t>Quella battuta non strappò sorrisi. «Pete Garcia ce l'ha con quel negozio da quando—»</w:t>
+        <w:t>Questa volta non ci fu nessun sorriso. «Pete Garcia ce l'ha con quel negozio da quando—»</w:t>
       </w:r>
     </w:p>
     <w:p/>
@@ -6160,7 +6160,7 @@
     <w:p/>
     <w:p>
       <w:r>
-        <w:t>«Ti ho pagato» disse. «Ti ho pagato ogni mese per otto anni, Joyce, e in alcuni di quei mesi ti ho pagato prima di pagare il gasolio, e ho ancora le ricevute in una scatola da scarpe se il capo vuole leggerle. Mi hai chiesto di riacquistare la tua quota. Sei entrata in quella cucina e mi hai detto che eri stufa marcia della torta alle quattro del mattino, che volevi il pane, pane vero, all'ingrosso, camion, contatti commerciali, e io ti ho risposto va bene. E ti ho pagato.»</w:t>
+        <w:t>«Ti ho pagato» disse. «Ti ho pagato ogni mese per otto anni, Joyce, e in alcuni di quei mesi ti ho pagato prima di pagare il gasolio, e ho ancora le ricevute in una scatola da scarpe se il capo vuole leggerle. Mi hai chiesto di rilevare la tua quota. Te ne stavi lì in quella cucina e mi hai detto che eri stufa marcia della torta alle quattro del mattino, che volevi il pane, pane vero, all'ingrosso, camion, contatti commerciali, e io ti ho risposto va bene. E ti ho pagato.»</w:t>
       </w:r>
     </w:p>
     <w:p/>
@@ -6214,7 +6214,7 @@
     <w:p/>
     <w:p>
       <w:r>
-        <w:t>«E mi hai lasciato credere che fosse colpa delle mie mani.» La voce di Greta si abbassò. «Quattro infornate. Sono rimasta in piedi nella mia cucina a dirmi: Greta, è finita, ti è sfuggito di mano e sei troppo vecchia per accorgertene. Sapevi che l'avrei pensato. Mi conoscevi da quindici anni. Sapevi che quella era l'unica cosa a cui avrei creduto.»</w:t>
+        <w:t>«E mi hai lasciato credere che fosse colpa delle mie mani.» La voce di Greta si abbassò. «Quattro infornate. Sono rimasta in piedi nella mia cucina a dirmi: Greta, è finita, le tue dita hanno perso il tocco e sei troppo vecchia per accorgertene. Sapevi che l'avrei pensato. Mi conoscevi da quindici anni. Sapevi che quella era l'unica cosa a cui avrei creduto.»</w:t>
       </w:r>
     </w:p>
     <w:p/>
@@ -6256,7 +6256,7 @@
     <w:p/>
     <w:p>
       <w:r>
-        <w:t>«La mia mano non è mai stata il problema» disse Greta. «Tu lo eri.» E unì le due mani sul tavolo davanti a sé, e aveva finito.</w:t>
+        <w:t>«La mia mano non è mai stata il problema» disse Greta. «Il problema eri tu.» E unì le due mani sul tavolo davanti a sé, e aveva finito.</w:t>
       </w:r>
     </w:p>
     <w:p/>
@@ -6483,7 +6483,7 @@
     </w:p>
     <w:p>
       <w:r>
-        <w:t>«Sì» disse Renée. «Si era sbagliata.»</w:t>
+        <w:t>«Sì» disse Renée. «Si è sbagliata.»</w:t>
       </w:r>
     </w:p>
     <w:p>
@@ -6493,7 +6493,7 @@
     </w:p>
     <w:p>
       <w:r>
-        <w:t>«Il capo è passato ieri sera per la mia deposizione.» Posò lo straccio sul marmo. «C'è da credere che quel mattone sia uscito apposta dal mio cassonetto. Che qualcuno si sia preso il disturbo di far sembrare il mio negozio il tipo di posto capace di una simile bassezza.» Mi guardò dritta negli occhi. «Grazie per essere venuta a dirmelo. C'era altro?»</w:t>
+        <w:t>«Il capo è passato ieri sera per la mia deposizione.» Posò lo straccio sul marmo. «A quanto pare quel mattone è uscito apposta dal mio cassonetto. Che qualcuno si sia preso il disturbo di far sembrare il mio negozio il tipo di posto capace di una simile bassezza.» Mi guardò dritta negli occhi. «Grazie per essere venuta a dirmelo. C'era altro?»</w:t>
       </w:r>
     </w:p>
     <w:p>
@@ -6503,7 +6503,7 @@
     </w:p>
     <w:p>
       <w:r>
-        <w:t>«Allora devo occuparmi dei miei vassoi.» Chinò il capo, non più di quanto richiedesse la buona educazione, e tornò nel retro attraverso la porta a vetri oscillanti.</w:t>
+        <w:t>«Allora devo occuparmi dei miei vassoi.» Chinò il capo, non più di quanto richiedesse la buona educazione, e tornò nel retro attraverso la porta a battente.</w:t>
       </w:r>
     </w:p>
     <w:p>
@@ -6518,7 +6518,7 @@
     </w:p>
     <w:p>
       <w:r>
-        <w:t xml:space="preserve">Nick aveva acceso la stufa a legna nell'officina quando tornai a casa, e una teiera fumante troneggiava sul banco accanto al pattino di una slitta che stava modellando. Pip si diresse verso il focolare in pietra grezza, dove un piattino di latterini la stava aspettando, e si mise all'opera.</w:t>
+        <w:t xml:space="preserve">Nick aveva acceso la stufa a legna nell'officina quando tornai a casa, e una teiera fumante troneggiava sul banco accanto al pattino di una slitta che stava modellando. Pip si diresse verso il focolare in pietra grezza, dove un piattino di spratti la stava aspettando, e si mise all'opera.</w:t>
       </w:r>
     </w:p>
     <w:p>
@@ -6573,7 +6573,7 @@
     </w:p>
     <w:p>
       <w:r>
-        <w:t>Pip finì i latterini e spinse il piattino vuoto sulla pietra fino al mio stivale con il becco. Rimasi seduta con il tè mentre la pialla scorreva lungo il pattino con passaggi lunghi e regolari e i trucioli cadevano pallidi sul pavimento, finché le mie mani non furono calde e fu ora di scendere da Greta.</w:t>
+        <w:t>Pip finì gli spratti e spinse il piattino vuoto sulla pietra fino al mio stivale con il becco. Rimasi seduta con il tè mentre la pialla scorreva lungo il pattino con passaggi lunghi e regolari e i trucioli cadevano pallidi sul pavimento, finché le mie mani non furono calde e fu ora di scendere da Greta.</w:t>
       </w:r>
     </w:p>
     <w:p>
@@ -6619,7 +6619,7 @@
     </w:p>
     <w:p>
       <w:r>
-        <w:t>La gente da queste parti porta la zuppa a una casa dove c'è stato un malato. Non era rimasto nessun malato da sfamare, così svuotarono invece i suoi scaffali. Alle due la fila usciva dalla porta della Holly Jolly e arrivava a metà isolato, pestando i piedi nel freddo. Greta aveva acceso tutti i forni, e il vapore sui vetri era così denso che non si riusciva a leggere HOLLY JOLLY dalla strada. I dolcetti al cacao erano finiti già alle due e mezza. I biscotti allo zenzero, fino al fondo del barattolo. Mise in forno una infornata di girelle alla cannella alle tre, un orario in cui non avrebbe dovuto farlo così tardi, e le vendette tutte calde e senza glassa, prima ancora che si fossero raffreddate.</w:t>
+        <w:t>La gente da queste parti porta la zuppa a una casa dove c'è stato un malato. Non era rimasto nessun malato da sfamare, così svuotarono invece i suoi scaffali. Alle due la fila usciva dalla porta della Holly Jolly e arrivava a metà isolato, pestando i piedi nel freddo. Greta aveva acceso tutti i forni, e il vapore sui vetri era così denso che non si riusciva a leggere HOLLY JOLLY dalla strada. I dolcetti al cacao erano finiti già alle due e mezza. I biscotti allo zenzero, fino al fondo del barattolo. Alle tre, decisamente troppo tardi, mise in forno un'infornata di girelle alla cannella, e le vendette tutte calde e senza glassa, prima ancora che si fossero raffreddate.</w:t>
       </w:r>
     </w:p>
     <w:p>
@@ -6704,7 +6704,7 @@
     </w:p>
     <w:p>
       <w:r>
-        <w:t>Mi tirò dietro il banco quando la fila si diradò, nel tepore del retro dove i forni ticchettavano, e mi mostrò il cassetto della cassa. Non si chiudeva. «Guardalo» disse. Non stava esultando. Aveva investito i suoi risparmi in farina buona e l'aveva vista rovinarsi, infornata dopo infornata, con il foglio giallo posato sul banco, e ora sembrava soltanto sbalordita. «Un solo pomeriggio, Jessica. E ci sono i soldi del tribunale che arriveranno a breve, dollaro per dollaro di quello che ha rovinato. Il capo mi ha letto la cifra che chiederanno.» Schiacciò il cassetto con il palmo della mano e poi rinunciò. «Ero in perdita. Non fingo di non esserlo stata. Stavo sveglia la notte a fare i conti, e il paese li ha risarciti in un solo pomeriggio, e nessuno l'ha chiamata carità. L'hanno chiamata lunedì.» Guardò fuori attraverso i vetri appannati la fila che pestava ancora i piedi nel freddo per le girelle alla cannella di cui ne stava già impastando altre.</w:t>
+        <w:t>Mi tirò dietro il banco quando la fila si diradò, nel tepore del retro dove i forni ticchettavano, e mi mostrò il cassetto della cassa. Non si chiudeva. «Guardalo» disse. Non stava esultando. Aveva investito i suoi risparmi in farina buona e l'aveva vista rovinarsi, infornata dopo infornata, con il foglio giallo posato sul banco, e ora sembrava soltanto sbalordita. «Un solo pomeriggio, Jessica. E ci sono i soldi del tribunale che arriveranno a breve, dollaro per dollaro di quello che ha rovinato. Il capo mi ha letto la cifra che chiederanno.» Schiacciò il cassetto con il palmo della mano e poi rinunciò. «Ero in perdita. Non fingo di non esserlo stata. Stavo sveglia la notte a fare i conti, e il paese li ha risarciti in un solo pomeriggio, e nessuno l'ha chiamata carità. L'hanno chiamata lunedì.» Guardò fuori attraverso i vetri appannati la fila che pestava ancora i piedi nel freddo per le girelle alla cannella, di cui stava già impastando un'altra dose.</w:t>
       </w:r>
     </w:p>
     <w:p>
@@ -6810,7 +6810,7 @@
     </w:p>
     <w:p>
       <w:r>
-        <w:t>«Niente» disse. «Va' a occuparti di qualcun altro.»</w:t>
+        <w:t>«Niente» disse. «Va' a contare qualcun altro.»</w:t>
       </w:r>
     </w:p>
     <w:p>
@@ -6830,7 +6830,7 @@
     </w:p>
     <w:p>
       <w:r>
-        <w:t>«Ci sta facendo i conti» disse Ivy, infilando un biglietto da cinque sotto quello sguardo. «Sono stata controllata da gente più amichevole.»</w:t>
+        <w:t>«Ci sta facendo la revisione dei conti» disse Ivy, infilando un biglietto da cinque sotto quello sguardo. «Sono stata controllata da gente più amichevole.»</w:t>
       </w:r>
     </w:p>
     <w:p>
@@ -6845,7 +6845,7 @@
     </w:p>
     <w:p>
       <w:r>
-        <w:t>Misi i miei soldi nella scatola senza contarli dove chiunque potesse vederci.</w:t>
+        <w:t>Misi i miei soldi nella scatola senza contarli sotto gli occhi di tutti.</w:t>
       </w:r>
     </w:p>
     <w:p>
@@ -6983,7 +6983,7 @@
     </w:p>
     <w:p>
       <w:r>
-        <w:t>«Non mi sta più» disse alla scatola, e alla stanza. «Così la bambina tra cento anni potrà averla. Anche lei avrà le mani fredde. Ce l'hanno tutti, qui.» La depose, piccola e rossa contro il cedro, accanto alle due minuscole manopole di Bram e a quella che avevo deposto alla Grange, e fece un passo indietro infilandosi nel cappotto di Martha.</w:t>
+        <w:t>«Non mi sta più» disse alla scatola, e alla stanza. «Così la bambina tra cento anni potrà averla. Anche lei avrà le mani fredde. Ce l'hanno tutti, qui.» La depose, piccola e rossa contro il cedro, accanto alle due minuscole manopole di Bram e a quella che avevo deposto alla Grange, e indietreggiò fino a rifugiarsi contro il cappotto di Martha.</w:t>
       </w:r>
     </w:p>
     <w:p>
@@ -7072,7 +7072,7 @@
     </w:p>
     <w:p>
       <w:r>
-        <w:t>Nick attraversò la folla e trovò la mia mano. Me ne stavo in mezzo al cerchio caldo con Pip pesante tra le braccia. In una lunga vita avevo visto ogni angolo di ogni paese, e non ero mai stata in una stanza più calda di quella.</w:t>
+        <w:t>Nick attraversò la folla e trovò la mia mano. Me ne stavo in mezzo al cerchio caldo con Pip pesante tra le braccia. In una lunga vita avevo visto qualche angolo di ogni paese, e non ero mai stata in una stanza più calda di quella.</w:t>
       </w:r>
     </w:p>
     <w:p>
@@ -7098,7 +7098,7 @@
     </w:p>
     <w:p>
       <w:r>
-        <w:t>«Sei mattiniera» disse Greta, senza alzare lo sguardo, facendo scivolare la teglia al suo posto e chiudendo il forno con l'anca. «L'ordine delle ghirlande non è inscatolato. Siediti. Prendi qualcosa. Ho sfornato un plumcake speziato che ha bisogno di un verdetto.»</w:t>
+        <w:t>«Sei in anticipo» disse Greta, senza alzare lo sguardo, facendo scivolare la teglia al suo posto e chiudendo il forno con l'anca. «L'ordine delle ghirlande non è inscatolato. Siediti. Prendi qualcosa. Ho sfornato un plumcake speziato che ha bisogno di un verdetto.»</w:t>
       </w:r>
     </w:p>
     <w:p>
@@ -7139,7 +7139,7 @@
         <w:rPr>
           <w:i/>
         </w:rPr>
-        <w:t>Non scrivo per sfuggire a qualcosa. Andrò in tribunale e pagherò ciò che dicono che io debba, e dovrei farlo.</w:t>
+        <w:t>Non scrivo per sfuggire a qualcosa. Andrò in tribunale e pagherò ciò che dicono che io debba, ed è giusto così.</w:t>
       </w:r>
     </w:p>
     <w:p>
@@ -7193,7 +7193,7 @@
     </w:p>
     <w:p>
       <w:r>
-        <w:t>«Non per dire che sia perdonato. Quello spetta a te deciderlo, e nessuno ha il diritto di metterti fretta. Ma lei ha scritto per dirti che la torta è tua. Mandale una, e saprà che l'hai letta.»</w:t>
+        <w:t>«Non per dire che sia perdonato. Quello spetta a te deciderlo, e nessuno ha il diritto di metterti fretta. Ma lei ha scritto per dirti che la torta è tua. Mandagliene una, e saprà che l'hai letta.»</w:t>
       </w:r>
     </w:p>
     <w:p>
@@ -7318,17 +7318,17 @@
     </w:p>
     <w:p>
       <w:r>
-        <w:t>Posai i miei pacchi e andai da lui. Mi prese la mano e la stese piatta contro le pietre tonde di campo. Erano caldi sotto il mio palmo e d'oro alla vista, come lo erano stati sin dalla notte in cui me li aveva mostrati, con la luce che sorgeva dalla pietra nuda stessa. E nella grata, dove nulla era mai stato posato, alcuni fili d'oro erano scesi dall'aria e giacevano lungo le sbarre di ferro, bassi e costanti, come i primi carboni di un fuoco che nessuno aveva acceso.</w:t>
-      </w:r>
-    </w:p>
-    <w:p>
-      <w:r>
-        <w:t>«È più vicino» disse. «Si è avvicinato per tutta la settimana, ogni notte di più. Non so perché.» Girò la mia mano sotto la sua, entrambi con i palmi piatti sulla pietra. «Si solleverà di nuovo entro mattina. Ma stanotte è più vicino al fuoco di quanto sia mai stato, e volevo che tu lo sentissi finché è qui.»</w:t>
-      </w:r>
-    </w:p>
-    <w:p>
-      <w:r>
-        <w:t>Era lì sotto il mio palmo: la magia libera e lieta di mille Natali, tirata a un palmo dal suo focolare. Oltre la finestra dell'officina la neve cadeva costante sul cortile e sulla stradina. Stava cadendo anche sul paese, sulle scatole della Società e sui pupazzi di neve sul prato. Su Evergreen, Greta avrebbe avuto tutti e sei i forni accesi contro il buio.</w:t>
+        <w:t>Posai i miei pacchi e andai da lui. Mi prese la mano e la stese piatta contro le pietre tonde di campo. Erano calde sotto il mio palmo e d'oro alla vista, come lo erano state sin dalla notte in cui me le aveva mostrate, con la luce che sorgeva dalla pietra nuda stessa. E nella grata, dove nulla era mai stato posato, alcuni fili d'oro erano scesi dall'aria e giacevano lungo le sbarre di ferro, bassi e costanti, come i primi carboni di un fuoco che nessuno aveva acceso.</w:t>
+      </w:r>
+    </w:p>
+    <w:p>
+      <w:r>
+        <w:t>«È più vicina» disse. «Si è avvicinata per tutta la settimana, ogni notte di più. Non so perché.» Girò la mia mano sotto la sua, entrambi con i palmi piatti sulla pietra. «Si solleverà di nuovo entro mattina. Ma stanotte è più vicina al fuoco di quanto sia mai stata, e volevo che tu la sentissi finché è qui.»</w:t>
+      </w:r>
+    </w:p>
+    <w:p>
+      <w:r>
+        <w:t>Era lì sotto il mio palmo: la magia libera e lieta di mille Natali, avvicinatasi di un palmo al suo focolare. Oltre la finestra dell'officina la neve cadeva costante sul cortile e sulla stradina. Stava cadendo anche sul paese, sulle scatole della Società e sui pupazzi di neve sul prato. Su Evergreen, Greta avrebbe avuto tutti e sei i forni accesi contro il buio.</w:t>
       </w:r>
     </w:p>
     <w:p>

</xml_diff>